<commit_message>
feat: initial telco churn pipeline
</commit_message>
<xml_diff>
--- a/churn_prediction_project/reports/Telco customer churn prediction system.docx
+++ b/churn_prediction_project/reports/Telco customer churn prediction system.docx
@@ -19,141 +19,1982 @@
         <w:pStyle w:val="Heading1"/>
       </w:pPr>
       <w:r>
-        <w:t>Problem statement:</w:t>
-      </w:r>
-    </w:p>
-    <w:p>
-      <w:r>
-        <w:t>Predict which Telco customers are likely to churn in the next billing cycle so the business can prioritize retention actions and reduce churn-related revenue loss.</w:t>
-      </w:r>
-    </w:p>
-    <w:p>
-      <w:r>
-        <w:rPr>
-          <w:b/>
-          <w:bCs/>
-        </w:rPr>
-        <w:t>Sub-questions / hypotheses</w:t>
+        <w:t>1. Project Overview (Business Explanation)</w:t>
+      </w:r>
+    </w:p>
+    <w:p>
+      <w:r>
+        <w:t>Customer churn is one of the biggest challenges for subscription-based businesses.</w:t>
+      </w:r>
+      <w:r>
+        <w:br/>
+        <w:t xml:space="preserve">The goal of this project is </w:t>
+      </w:r>
+      <w:r>
+        <w:rPr>
+          <w:b/>
+          <w:bCs/>
+        </w:rPr>
+        <w:t>to predict which customers are most likely to discontinue their service</w:t>
+      </w:r>
+      <w:r>
+        <w:t>, so the business can take action before losing revenue.</w:t>
+      </w:r>
+    </w:p>
+    <w:p>
+      <w:r>
+        <w:t xml:space="preserve">This project uses </w:t>
+      </w:r>
+      <w:r>
+        <w:rPr>
+          <w:b/>
+          <w:bCs/>
+        </w:rPr>
+        <w:t xml:space="preserve">historical customer </w:t>
+      </w:r>
+      <w:proofErr w:type="spellStart"/>
+      <w:r>
+        <w:rPr>
+          <w:b/>
+          <w:bCs/>
+        </w:rPr>
+        <w:t>behavior</w:t>
+      </w:r>
+      <w:proofErr w:type="spellEnd"/>
+      <w:r>
+        <w:t xml:space="preserve">, service usage patterns, and account details to build a machine learning model that identifies </w:t>
+      </w:r>
+      <w:r>
+        <w:rPr>
+          <w:b/>
+          <w:bCs/>
+        </w:rPr>
+        <w:t>high-risk customers</w:t>
+      </w:r>
+      <w:r>
+        <w:t>.</w:t>
+      </w:r>
+    </w:p>
+    <w:p>
+      <w:r>
+        <w:t xml:space="preserve">The final output is a </w:t>
+      </w:r>
+      <w:proofErr w:type="spellStart"/>
+      <w:r>
+        <w:rPr>
+          <w:b/>
+          <w:bCs/>
+        </w:rPr>
+        <w:t>Streamlit</w:t>
+      </w:r>
+      <w:proofErr w:type="spellEnd"/>
+      <w:r>
+        <w:rPr>
+          <w:b/>
+          <w:bCs/>
+        </w:rPr>
+        <w:t xml:space="preserve"> web application</w:t>
+      </w:r>
+      <w:r>
+        <w:t xml:space="preserve"> where a user (e.g., call-</w:t>
+      </w:r>
+      <w:proofErr w:type="spellStart"/>
+      <w:r>
+        <w:t>center</w:t>
+      </w:r>
+      <w:proofErr w:type="spellEnd"/>
+      <w:r>
+        <w:t xml:space="preserve"> agent, retention specialist, product manager) can enter customer details and instantly see:</w:t>
       </w:r>
     </w:p>
     <w:p>
       <w:pPr>
         <w:numPr>
           <w:ilvl w:val="0"/>
-          <w:numId w:val="2"/>
+          <w:numId w:val="5"/>
         </w:numPr>
       </w:pPr>
       <w:r>
-        <w:t>Which customer segments have the highest churn rate (contract, payment method, add-ons)?</w:t>
+        <w:rPr>
+          <w:b/>
+          <w:bCs/>
+        </w:rPr>
+        <w:t>Churn probability (0–100%)</w:t>
       </w:r>
     </w:p>
     <w:p>
       <w:pPr>
         <w:numPr>
           <w:ilvl w:val="0"/>
-          <w:numId w:val="2"/>
+          <w:numId w:val="5"/>
         </w:numPr>
       </w:pPr>
       <w:r>
-        <w:t>Can we detect churn early (tenure ≤ 3 months) with reasonable recall?</w:t>
+        <w:rPr>
+          <w:b/>
+          <w:bCs/>
+        </w:rPr>
+        <w:t>Risk label (Likely / Not Likely)</w:t>
       </w:r>
     </w:p>
     <w:p>
       <w:pPr>
         <w:numPr>
           <w:ilvl w:val="0"/>
-          <w:numId w:val="2"/>
+          <w:numId w:val="5"/>
         </w:numPr>
       </w:pPr>
       <w:r>
-        <w:t>Which features are actionable (i.e., tie to interventions like discounts or support)?</w:t>
-      </w:r>
-    </w:p>
-    <w:p>
-      <w:r>
-        <w:rPr>
-          <w:b/>
-          <w:bCs/>
-        </w:rPr>
-        <w:t>Success metrics (choose primary + secondary)</w:t>
+        <w:t xml:space="preserve">Business-friendly insights based on customer </w:t>
+      </w:r>
+      <w:proofErr w:type="spellStart"/>
+      <w:r>
+        <w:t>behavior</w:t>
+      </w:r>
+      <w:proofErr w:type="spellEnd"/>
+    </w:p>
+    <w:p>
+      <w:r>
+        <w:t xml:space="preserve">This helps leadership make </w:t>
+      </w:r>
+      <w:r>
+        <w:rPr>
+          <w:b/>
+          <w:bCs/>
+        </w:rPr>
+        <w:t>data-driven retention decisions</w:t>
+      </w:r>
+      <w:r>
+        <w:t xml:space="preserve"> instead of relying only on intuition.</w:t>
+      </w:r>
+    </w:p>
+    <w:p>
+      <w:r>
+        <w:pict w14:anchorId="703B1C41">
+          <v:rect id="_x0000_i1295" style="width:0;height:1.5pt" o:hralign="center" o:hrstd="t" o:hr="t" fillcolor="#a0a0a0" stroked="f"/>
+        </w:pict>
+      </w:r>
+    </w:p>
+    <w:p>
+      <w:pPr>
+        <w:pStyle w:val="Heading1"/>
+      </w:pPr>
+      <w:r>
+        <w:t>2. Why Churn Prediction Matters</w:t>
+      </w:r>
+    </w:p>
+    <w:p>
+      <w:r>
+        <w:t>Churn models support key business functions:</w:t>
+      </w:r>
+    </w:p>
+    <w:p>
+      <w:pPr>
+        <w:rPr>
+          <w:b/>
+          <w:bCs/>
+        </w:rPr>
+      </w:pPr>
+      <w:r>
+        <w:rPr>
+          <w:rFonts w:ascii="Segoe UI Symbol" w:hAnsi="Segoe UI Symbol" w:cs="Segoe UI Symbol"/>
+          <w:b/>
+          <w:bCs/>
+        </w:rPr>
+        <w:t>✔</w:t>
+      </w:r>
+      <w:r>
+        <w:rPr>
+          <w:b/>
+          <w:bCs/>
+        </w:rPr>
+        <w:t xml:space="preserve"> Reduce Revenue Loss</w:t>
+      </w:r>
+    </w:p>
+    <w:p>
+      <w:r>
+        <w:t>Predicting churn helps focus retention offers on customers most likely to leave.</w:t>
+      </w:r>
+    </w:p>
+    <w:p>
+      <w:pPr>
+        <w:rPr>
+          <w:b/>
+          <w:bCs/>
+        </w:rPr>
+      </w:pPr>
+      <w:r>
+        <w:rPr>
+          <w:rFonts w:ascii="Segoe UI Symbol" w:hAnsi="Segoe UI Symbol" w:cs="Segoe UI Symbol"/>
+          <w:b/>
+          <w:bCs/>
+        </w:rPr>
+        <w:t>✔</w:t>
+      </w:r>
+      <w:r>
+        <w:rPr>
+          <w:b/>
+          <w:bCs/>
+        </w:rPr>
+        <w:t xml:space="preserve"> Improve Customer Lifetime Value (CLV)</w:t>
+      </w:r>
+    </w:p>
+    <w:p>
+      <w:r>
+        <w:t>Interventions on the right customers directly improve LTV.</w:t>
+      </w:r>
+    </w:p>
+    <w:p>
+      <w:pPr>
+        <w:rPr>
+          <w:b/>
+          <w:bCs/>
+        </w:rPr>
+      </w:pPr>
+      <w:r>
+        <w:rPr>
+          <w:rFonts w:ascii="Segoe UI Symbol" w:hAnsi="Segoe UI Symbol" w:cs="Segoe UI Symbol"/>
+          <w:b/>
+          <w:bCs/>
+        </w:rPr>
+        <w:t>✔</w:t>
+      </w:r>
+      <w:r>
+        <w:rPr>
+          <w:b/>
+          <w:bCs/>
+        </w:rPr>
+        <w:t xml:space="preserve"> Better Resource Allocation</w:t>
+      </w:r>
+    </w:p>
+    <w:p>
+      <w:r>
+        <w:t>Retention campaigns are expensive.</w:t>
+      </w:r>
+      <w:r>
+        <w:br/>
+        <w:t xml:space="preserve">ML ensures efforts are </w:t>
+      </w:r>
+      <w:r>
+        <w:rPr>
+          <w:b/>
+          <w:bCs/>
+        </w:rPr>
+        <w:t>targeted</w:t>
+      </w:r>
+      <w:r>
+        <w:t>, not blanket-discounted.</w:t>
+      </w:r>
+    </w:p>
+    <w:p>
+      <w:pPr>
+        <w:rPr>
+          <w:b/>
+          <w:bCs/>
+        </w:rPr>
+      </w:pPr>
+      <w:r>
+        <w:rPr>
+          <w:rFonts w:ascii="Segoe UI Symbol" w:hAnsi="Segoe UI Symbol" w:cs="Segoe UI Symbol"/>
+          <w:b/>
+          <w:bCs/>
+        </w:rPr>
+        <w:t>✔</w:t>
+      </w:r>
+      <w:r>
+        <w:rPr>
+          <w:b/>
+          <w:bCs/>
+        </w:rPr>
+        <w:t xml:space="preserve"> Increase Customer Satisfaction</w:t>
+      </w:r>
+    </w:p>
+    <w:p>
+      <w:r>
+        <w:t>Proactive outreach makes customers feel valued.</w:t>
+      </w:r>
+    </w:p>
+    <w:p>
+      <w:r>
+        <w:pict w14:anchorId="26B7CCBF">
+          <v:rect id="_x0000_i1296" style="width:0;height:1.5pt" o:hralign="center" o:hrstd="t" o:hr="t" fillcolor="#a0a0a0" stroked="f"/>
+        </w:pict>
+      </w:r>
+    </w:p>
+    <w:p>
+      <w:pPr>
+        <w:pStyle w:val="Heading1"/>
+      </w:pPr>
+      <w:r>
+        <w:t>3. What This System Does (Non-Technical Summary)</w:t>
+      </w:r>
+    </w:p>
+    <w:p>
+      <w:r>
+        <w:t>The system:</w:t>
+      </w:r>
+    </w:p>
+    <w:p>
+      <w:pPr>
+        <w:rPr>
+          <w:b/>
+          <w:bCs/>
+        </w:rPr>
+      </w:pPr>
+      <w:r>
+        <w:rPr>
+          <w:b/>
+          <w:bCs/>
+        </w:rPr>
+        <w:t>1️</w:t>
+      </w:r>
+      <w:r>
+        <w:rPr>
+          <w:rFonts w:ascii="Segoe UI Symbol" w:hAnsi="Segoe UI Symbol" w:cs="Segoe UI Symbol"/>
+          <w:b/>
+          <w:bCs/>
+        </w:rPr>
+        <w:t>⃣</w:t>
+      </w:r>
+      <w:r>
+        <w:rPr>
+          <w:b/>
+          <w:bCs/>
+        </w:rPr>
+        <w:t xml:space="preserve"> Reads customer profile and service usage data</w:t>
+      </w:r>
+    </w:p>
+    <w:p>
+      <w:r>
+        <w:t>Examples:</w:t>
       </w:r>
     </w:p>
     <w:p>
       <w:pPr>
         <w:numPr>
           <w:ilvl w:val="0"/>
-          <w:numId w:val="3"/>
+          <w:numId w:val="6"/>
         </w:numPr>
       </w:pPr>
       <w:r>
-        <w:rPr>
-          <w:b/>
-          <w:bCs/>
-        </w:rPr>
-        <w:t>Primary:</w:t>
-      </w:r>
-      <w:r>
-        <w:t xml:space="preserve"> Recall for the churn class (business wants to catch churners).</w:t>
+        <w:t>Tenure</w:t>
       </w:r>
     </w:p>
     <w:p>
       <w:pPr>
         <w:numPr>
           <w:ilvl w:val="0"/>
-          <w:numId w:val="3"/>
+          <w:numId w:val="6"/>
         </w:numPr>
       </w:pPr>
       <w:r>
-        <w:rPr>
-          <w:b/>
-          <w:bCs/>
-        </w:rPr>
-        <w:t>Secondary:</w:t>
-      </w:r>
-      <w:r>
-        <w:t xml:space="preserve"> F1-score, ROC-AUC, Precision (to limit wasted retention spend).</w:t>
-      </w:r>
-    </w:p>
-    <w:p>
-      <w:r>
-        <w:rPr>
-          <w:b/>
-          <w:bCs/>
-        </w:rPr>
-        <w:t>Deliverables</w:t>
+        <w:t>Contract type</w:t>
       </w:r>
     </w:p>
     <w:p>
       <w:pPr>
         <w:numPr>
           <w:ilvl w:val="0"/>
-          <w:numId w:val="4"/>
+          <w:numId w:val="6"/>
         </w:numPr>
       </w:pPr>
       <w:r>
-        <w:t>One-line problem statement</w:t>
+        <w:lastRenderedPageBreak/>
+        <w:t>Monthly charges</w:t>
       </w:r>
     </w:p>
     <w:p>
       <w:pPr>
         <w:numPr>
           <w:ilvl w:val="0"/>
-          <w:numId w:val="4"/>
+          <w:numId w:val="6"/>
         </w:numPr>
       </w:pPr>
       <w:r>
-        <w:t>Target metric and threshold (e.g., recall &gt;= 0.70 target — tune later)</w:t>
+        <w:t>Services subscribed</w:t>
       </w:r>
     </w:p>
     <w:p>
       <w:pPr>
         <w:numPr>
           <w:ilvl w:val="0"/>
-          <w:numId w:val="4"/>
+          <w:numId w:val="6"/>
         </w:numPr>
       </w:pPr>
       <w:r>
-        <w:t>Short business impact note (how model outputs will be used)</w:t>
+        <w:t>Whether they use support add-ons</w:t>
+      </w:r>
+    </w:p>
+    <w:p>
+      <w:r>
+        <w:pict w14:anchorId="74367AD9">
+          <v:rect id="_x0000_i1297" style="width:0;height:1.5pt" o:hralign="center" o:hrstd="t" o:hr="t" fillcolor="#a0a0a0" stroked="f"/>
+        </w:pict>
+      </w:r>
+    </w:p>
+    <w:p>
+      <w:pPr>
+        <w:rPr>
+          <w:b/>
+          <w:bCs/>
+        </w:rPr>
+      </w:pPr>
+      <w:r>
+        <w:rPr>
+          <w:b/>
+          <w:bCs/>
+        </w:rPr>
+        <w:t>2️</w:t>
+      </w:r>
+      <w:r>
+        <w:rPr>
+          <w:rFonts w:ascii="Segoe UI Symbol" w:hAnsi="Segoe UI Symbol" w:cs="Segoe UI Symbol"/>
+          <w:b/>
+          <w:bCs/>
+        </w:rPr>
+        <w:t>⃣</w:t>
+      </w:r>
+      <w:r>
+        <w:rPr>
+          <w:b/>
+          <w:bCs/>
+        </w:rPr>
+        <w:t xml:space="preserve"> Learns patterns of customers who previously churned</w:t>
+      </w:r>
+    </w:p>
+    <w:p>
+      <w:r>
+        <w:t xml:space="preserve">Machine Learning identifies which </w:t>
+      </w:r>
+      <w:proofErr w:type="spellStart"/>
+      <w:r>
+        <w:t>behaviors</w:t>
+      </w:r>
+      <w:proofErr w:type="spellEnd"/>
+      <w:r>
+        <w:t xml:space="preserve"> often lead to churn.</w:t>
+      </w:r>
+    </w:p>
+    <w:p>
+      <w:r>
+        <w:pict w14:anchorId="6913D143">
+          <v:rect id="_x0000_i1298" style="width:0;height:1.5pt" o:hralign="center" o:hrstd="t" o:hr="t" fillcolor="#a0a0a0" stroked="f"/>
+        </w:pict>
+      </w:r>
+    </w:p>
+    <w:p>
+      <w:pPr>
+        <w:rPr>
+          <w:b/>
+          <w:bCs/>
+        </w:rPr>
+      </w:pPr>
+      <w:r>
+        <w:rPr>
+          <w:b/>
+          <w:bCs/>
+        </w:rPr>
+        <w:t>3️</w:t>
+      </w:r>
+      <w:r>
+        <w:rPr>
+          <w:rFonts w:ascii="Segoe UI Symbol" w:hAnsi="Segoe UI Symbol" w:cs="Segoe UI Symbol"/>
+          <w:b/>
+          <w:bCs/>
+        </w:rPr>
+        <w:t>⃣</w:t>
+      </w:r>
+      <w:r>
+        <w:rPr>
+          <w:b/>
+          <w:bCs/>
+        </w:rPr>
+        <w:t xml:space="preserve"> Predicts the probability of churn for any new customer</w:t>
+      </w:r>
+    </w:p>
+    <w:p>
+      <w:r>
+        <w:t>For example:</w:t>
+      </w:r>
+    </w:p>
+    <w:tbl>
+      <w:tblPr>
+        <w:tblW w:w="0" w:type="auto"/>
+        <w:tblCellSpacing w:w="15" w:type="dxa"/>
+        <w:tblBorders>
+          <w:top w:val="single" w:sz="4" w:space="0" w:color="auto"/>
+          <w:left w:val="single" w:sz="4" w:space="0" w:color="auto"/>
+          <w:bottom w:val="single" w:sz="4" w:space="0" w:color="auto"/>
+          <w:right w:val="single" w:sz="4" w:space="0" w:color="auto"/>
+          <w:insideH w:val="single" w:sz="4" w:space="0" w:color="auto"/>
+          <w:insideV w:val="single" w:sz="4" w:space="0" w:color="auto"/>
+        </w:tblBorders>
+        <w:tblCellMar>
+          <w:top w:w="15" w:type="dxa"/>
+          <w:left w:w="15" w:type="dxa"/>
+          <w:bottom w:w="15" w:type="dxa"/>
+          <w:right w:w="15" w:type="dxa"/>
+        </w:tblCellMar>
+        <w:tblLook w:val="04A0" w:firstRow="1" w:lastRow="0" w:firstColumn="1" w:lastColumn="0" w:noHBand="0" w:noVBand="1"/>
+      </w:tblPr>
+      <w:tblGrid>
+        <w:gridCol w:w="4812"/>
+        <w:gridCol w:w="1189"/>
+      </w:tblGrid>
+      <w:tr>
+        <w:trPr>
+          <w:tblHeader/>
+          <w:tblCellSpacing w:w="15" w:type="dxa"/>
+        </w:trPr>
+        <w:tc>
+          <w:tcPr>
+            <w:tcW w:w="0" w:type="auto"/>
+            <w:vAlign w:val="center"/>
+            <w:hideMark/>
+          </w:tcPr>
+          <w:p>
+            <w:pPr>
+              <w:rPr>
+                <w:b/>
+                <w:bCs/>
+              </w:rPr>
+            </w:pPr>
+            <w:r>
+              <w:rPr>
+                <w:b/>
+                <w:bCs/>
+              </w:rPr>
+              <w:t>Customer Type</w:t>
+            </w:r>
+          </w:p>
+        </w:tc>
+        <w:tc>
+          <w:tcPr>
+            <w:tcW w:w="0" w:type="auto"/>
+            <w:vAlign w:val="center"/>
+            <w:hideMark/>
+          </w:tcPr>
+          <w:p>
+            <w:pPr>
+              <w:rPr>
+                <w:b/>
+                <w:bCs/>
+              </w:rPr>
+            </w:pPr>
+            <w:r>
+              <w:rPr>
+                <w:b/>
+                <w:bCs/>
+              </w:rPr>
+              <w:t>Churn Risk</w:t>
+            </w:r>
+          </w:p>
+        </w:tc>
+      </w:tr>
+      <w:tr>
+        <w:trPr>
+          <w:tblCellSpacing w:w="15" w:type="dxa"/>
+        </w:trPr>
+        <w:tc>
+          <w:tcPr>
+            <w:tcW w:w="0" w:type="auto"/>
+            <w:vAlign w:val="center"/>
+            <w:hideMark/>
+          </w:tcPr>
+          <w:p>
+            <w:r>
+              <w:t>Long-term, annual contract</w:t>
+            </w:r>
+          </w:p>
+        </w:tc>
+        <w:tc>
+          <w:tcPr>
+            <w:tcW w:w="0" w:type="auto"/>
+            <w:vAlign w:val="center"/>
+            <w:hideMark/>
+          </w:tcPr>
+          <w:p>
+            <w:r>
+              <w:t>Low</w:t>
+            </w:r>
+          </w:p>
+        </w:tc>
+      </w:tr>
+      <w:tr>
+        <w:trPr>
+          <w:tblCellSpacing w:w="15" w:type="dxa"/>
+        </w:trPr>
+        <w:tc>
+          <w:tcPr>
+            <w:tcW w:w="0" w:type="auto"/>
+            <w:vAlign w:val="center"/>
+            <w:hideMark/>
+          </w:tcPr>
+          <w:p>
+            <w:r>
+              <w:t>Month-to-month, high charges, low support usage</w:t>
+            </w:r>
+          </w:p>
+        </w:tc>
+        <w:tc>
+          <w:tcPr>
+            <w:tcW w:w="0" w:type="auto"/>
+            <w:vAlign w:val="center"/>
+            <w:hideMark/>
+          </w:tcPr>
+          <w:p>
+            <w:r>
+              <w:t>High</w:t>
+            </w:r>
+          </w:p>
+        </w:tc>
+      </w:tr>
+    </w:tbl>
+    <w:p>
+      <w:r>
+        <w:pict w14:anchorId="384FF00D">
+          <v:rect id="_x0000_i1299" style="width:0;height:1.5pt" o:hralign="center" o:hrstd="t" o:hr="t" fillcolor="#a0a0a0" stroked="f"/>
+        </w:pict>
+      </w:r>
+    </w:p>
+    <w:p>
+      <w:pPr>
+        <w:rPr>
+          <w:b/>
+          <w:bCs/>
+        </w:rPr>
+      </w:pPr>
+      <w:r>
+        <w:rPr>
+          <w:b/>
+          <w:bCs/>
+        </w:rPr>
+        <w:t>4️</w:t>
+      </w:r>
+      <w:r>
+        <w:rPr>
+          <w:rFonts w:ascii="Segoe UI Symbol" w:hAnsi="Segoe UI Symbol" w:cs="Segoe UI Symbol"/>
+          <w:b/>
+          <w:bCs/>
+        </w:rPr>
+        <w:t>⃣</w:t>
+      </w:r>
+      <w:r>
+        <w:rPr>
+          <w:b/>
+          <w:bCs/>
+        </w:rPr>
+        <w:t xml:space="preserve"> Provides clear business insights</w:t>
+      </w:r>
+    </w:p>
+    <w:p>
+      <w:r>
+        <w:t>Instead of black-box predictions, the model explains:</w:t>
+      </w:r>
+    </w:p>
+    <w:p>
+      <w:pPr>
+        <w:numPr>
+          <w:ilvl w:val="0"/>
+          <w:numId w:val="7"/>
+        </w:numPr>
+      </w:pPr>
+      <w:r>
+        <w:t>Why the customer might churn</w:t>
+      </w:r>
+    </w:p>
+    <w:p>
+      <w:pPr>
+        <w:numPr>
+          <w:ilvl w:val="0"/>
+          <w:numId w:val="7"/>
+        </w:numPr>
+      </w:pPr>
+      <w:r>
+        <w:t>Which factors influenced the score</w:t>
+      </w:r>
+    </w:p>
+    <w:p>
+      <w:pPr>
+        <w:numPr>
+          <w:ilvl w:val="0"/>
+          <w:numId w:val="7"/>
+        </w:numPr>
+      </w:pPr>
+      <w:r>
+        <w:t>What actions may reduce churn</w:t>
+      </w:r>
+    </w:p>
+    <w:p>
+      <w:r>
+        <w:t>This is useful for non-technical teams like Sales, Marketing, and Customer Support.</w:t>
+      </w:r>
+    </w:p>
+    <w:p>
+      <w:r>
+        <w:pict w14:anchorId="6DB8EE19">
+          <v:rect id="_x0000_i1300" style="width:0;height:1.5pt" o:hralign="center" o:hrstd="t" o:hr="t" fillcolor="#a0a0a0" stroked="f"/>
+        </w:pict>
+      </w:r>
+    </w:p>
+    <w:p>
+      <w:pPr>
+        <w:rPr>
+          <w:b/>
+          <w:bCs/>
+        </w:rPr>
+      </w:pPr>
+      <w:r>
+        <w:rPr>
+          <w:b/>
+          <w:bCs/>
+        </w:rPr>
+        <w:t>5️</w:t>
+      </w:r>
+      <w:r>
+        <w:rPr>
+          <w:rFonts w:ascii="Segoe UI Symbol" w:hAnsi="Segoe UI Symbol" w:cs="Segoe UI Symbol"/>
+          <w:b/>
+          <w:bCs/>
+        </w:rPr>
+        <w:t>⃣</w:t>
+      </w:r>
+      <w:r>
+        <w:rPr>
+          <w:b/>
+          <w:bCs/>
+        </w:rPr>
+        <w:t xml:space="preserve"> Shows results in a simple web interface</w:t>
+      </w:r>
+    </w:p>
+    <w:p>
+      <w:r>
+        <w:t xml:space="preserve">A </w:t>
+      </w:r>
+      <w:proofErr w:type="spellStart"/>
+      <w:r>
+        <w:t>Streamlit</w:t>
+      </w:r>
+      <w:proofErr w:type="spellEnd"/>
+      <w:r>
+        <w:t xml:space="preserve"> web app makes the solution </w:t>
+      </w:r>
+      <w:r>
+        <w:rPr>
+          <w:b/>
+          <w:bCs/>
+        </w:rPr>
+        <w:t>easy to use</w:t>
+      </w:r>
+      <w:r>
+        <w:t xml:space="preserve"> without technical knowledge.</w:t>
+      </w:r>
+    </w:p>
+    <w:p>
+      <w:r>
+        <w:pict w14:anchorId="6A932AF1">
+          <v:rect id="_x0000_i1301" style="width:0;height:1.5pt" o:hralign="center" o:hrstd="t" o:hr="t" fillcolor="#a0a0a0" stroked="f"/>
+        </w:pict>
+      </w:r>
+    </w:p>
+    <w:p>
+      <w:pPr>
+        <w:pStyle w:val="Heading1"/>
+      </w:pPr>
+      <w:r>
+        <w:t>4. What Data Was Used (Simple Terms)</w:t>
+      </w:r>
+    </w:p>
+    <w:p>
+      <w:r>
+        <w:t xml:space="preserve">Dataset: </w:t>
+      </w:r>
+      <w:r>
+        <w:rPr>
+          <w:b/>
+          <w:bCs/>
+        </w:rPr>
+        <w:t>Telco Customer Churn</w:t>
+      </w:r>
+      <w:r>
+        <w:t xml:space="preserve"> from IBM</w:t>
+      </w:r>
+      <w:r>
+        <w:br/>
+        <w:t>Size: ~7,000 customers</w:t>
+      </w:r>
+      <w:r>
+        <w:br/>
+        <w:t>Type: Subscription business data</w:t>
+      </w:r>
+    </w:p>
+    <w:p>
+      <w:pPr>
+        <w:rPr>
+          <w:b/>
+          <w:bCs/>
+        </w:rPr>
+      </w:pPr>
+      <w:r>
+        <w:rPr>
+          <w:b/>
+          <w:bCs/>
+        </w:rPr>
+        <w:t>Includes:</w:t>
+      </w:r>
+    </w:p>
+    <w:p>
+      <w:pPr>
+        <w:numPr>
+          <w:ilvl w:val="0"/>
+          <w:numId w:val="8"/>
+        </w:numPr>
+      </w:pPr>
+      <w:r>
+        <w:rPr>
+          <w:b/>
+          <w:bCs/>
+        </w:rPr>
+        <w:t>Customer demographics</w:t>
+      </w:r>
+      <w:r>
+        <w:t xml:space="preserve"> (gender, senior citizen, dependents)</w:t>
+      </w:r>
+    </w:p>
+    <w:p>
+      <w:pPr>
+        <w:numPr>
+          <w:ilvl w:val="0"/>
+          <w:numId w:val="8"/>
+        </w:numPr>
+      </w:pPr>
+      <w:r>
+        <w:rPr>
+          <w:b/>
+          <w:bCs/>
+        </w:rPr>
+        <w:t>Subscription details</w:t>
+      </w:r>
+      <w:r>
+        <w:t xml:space="preserve"> (contract type, payment method)</w:t>
+      </w:r>
+    </w:p>
+    <w:p>
+      <w:pPr>
+        <w:numPr>
+          <w:ilvl w:val="0"/>
+          <w:numId w:val="8"/>
+        </w:numPr>
+      </w:pPr>
+      <w:r>
+        <w:rPr>
+          <w:b/>
+          <w:bCs/>
+        </w:rPr>
+        <w:t>Billing information</w:t>
+      </w:r>
+      <w:r>
+        <w:t xml:space="preserve"> (monthly charges, total charges)</w:t>
+      </w:r>
+    </w:p>
+    <w:p>
+      <w:pPr>
+        <w:numPr>
+          <w:ilvl w:val="0"/>
+          <w:numId w:val="8"/>
+        </w:numPr>
+      </w:pPr>
+      <w:r>
+        <w:rPr>
+          <w:b/>
+          <w:bCs/>
+        </w:rPr>
+        <w:t>Services used</w:t>
+      </w:r>
+      <w:r>
+        <w:t xml:space="preserve"> (internet service, security, tech support)</w:t>
+      </w:r>
+    </w:p>
+    <w:p>
+      <w:pPr>
+        <w:numPr>
+          <w:ilvl w:val="0"/>
+          <w:numId w:val="8"/>
+        </w:numPr>
+      </w:pPr>
+      <w:r>
+        <w:rPr>
+          <w:b/>
+          <w:bCs/>
+        </w:rPr>
+        <w:t>Churn label</w:t>
+      </w:r>
+      <w:r>
+        <w:t xml:space="preserve"> (Yes/No)</w:t>
+      </w:r>
+    </w:p>
+    <w:p>
+      <w:r>
+        <w:lastRenderedPageBreak/>
+        <w:t>No personally identifiable information was used.</w:t>
+      </w:r>
+    </w:p>
+    <w:p>
+      <w:r>
+        <w:pict w14:anchorId="2AE3551D">
+          <v:rect id="_x0000_i1302" style="width:0;height:1.5pt" o:hralign="center" o:hrstd="t" o:hr="t" fillcolor="#a0a0a0" stroked="f"/>
+        </w:pict>
+      </w:r>
+    </w:p>
+    <w:p>
+      <w:pPr>
+        <w:pStyle w:val="Heading1"/>
+      </w:pPr>
+      <w:r>
+        <w:t>5. Key Insights from Data (Leadership-Focused)</w:t>
+      </w:r>
+    </w:p>
+    <w:p>
+      <w:r>
+        <w:t>During analysis, several strong patterns emerged:</w:t>
+      </w:r>
+    </w:p>
+    <w:p>
+      <w:pPr>
+        <w:rPr>
+          <w:b/>
+          <w:bCs/>
+        </w:rPr>
+      </w:pPr>
+      <w:r>
+        <w:rPr>
+          <w:rFonts w:ascii="Segoe UI Symbol" w:hAnsi="Segoe UI Symbol" w:cs="Segoe UI Symbol"/>
+          <w:b/>
+          <w:bCs/>
+        </w:rPr>
+        <w:t>✔</w:t>
+      </w:r>
+      <w:r>
+        <w:rPr>
+          <w:b/>
+          <w:bCs/>
+        </w:rPr>
+        <w:t xml:space="preserve"> 1. Month-to-month customers churn the most</w:t>
+      </w:r>
+    </w:p>
+    <w:p>
+      <w:r>
+        <w:t>They have the least commitment → highest risk.</w:t>
+      </w:r>
+    </w:p>
+    <w:p>
+      <w:pPr>
+        <w:rPr>
+          <w:b/>
+          <w:bCs/>
+        </w:rPr>
+      </w:pPr>
+      <w:r>
+        <w:rPr>
+          <w:rFonts w:ascii="Segoe UI Symbol" w:hAnsi="Segoe UI Symbol" w:cs="Segoe UI Symbol"/>
+          <w:b/>
+          <w:bCs/>
+        </w:rPr>
+        <w:t>✔</w:t>
+      </w:r>
+      <w:r>
+        <w:rPr>
+          <w:b/>
+          <w:bCs/>
+        </w:rPr>
+        <w:t xml:space="preserve"> 2. Customers with high monthly charges are more likely to churn</w:t>
+      </w:r>
+    </w:p>
+    <w:p>
+      <w:r>
+        <w:t>Pricing pressure is a major churn driver.</w:t>
+      </w:r>
+    </w:p>
+    <w:p>
+      <w:pPr>
+        <w:rPr>
+          <w:b/>
+          <w:bCs/>
+        </w:rPr>
+      </w:pPr>
+      <w:r>
+        <w:rPr>
+          <w:rFonts w:ascii="Segoe UI Symbol" w:hAnsi="Segoe UI Symbol" w:cs="Segoe UI Symbol"/>
+          <w:b/>
+          <w:bCs/>
+        </w:rPr>
+        <w:t>✔</w:t>
+      </w:r>
+      <w:r>
+        <w:rPr>
+          <w:b/>
+          <w:bCs/>
+        </w:rPr>
+        <w:t xml:space="preserve"> 3. Lack of support services increases risk</w:t>
+      </w:r>
+    </w:p>
+    <w:p>
+      <w:r>
+        <w:t>Customers without Tech Support or Online Security churn more.</w:t>
+      </w:r>
+    </w:p>
+    <w:p>
+      <w:pPr>
+        <w:rPr>
+          <w:b/>
+          <w:bCs/>
+        </w:rPr>
+      </w:pPr>
+      <w:r>
+        <w:rPr>
+          <w:rFonts w:ascii="Segoe UI Symbol" w:hAnsi="Segoe UI Symbol" w:cs="Segoe UI Symbol"/>
+          <w:b/>
+          <w:bCs/>
+        </w:rPr>
+        <w:t>✔</w:t>
+      </w:r>
+      <w:r>
+        <w:rPr>
+          <w:b/>
+          <w:bCs/>
+        </w:rPr>
+        <w:t xml:space="preserve"> 4. New customers (tenure &lt; 3 months) are at higher risk</w:t>
+      </w:r>
+    </w:p>
+    <w:p>
+      <w:r>
+        <w:t>Early experience is crucial for subscription retention.</w:t>
+      </w:r>
+    </w:p>
+    <w:p>
+      <w:pPr>
+        <w:rPr>
+          <w:b/>
+          <w:bCs/>
+        </w:rPr>
+      </w:pPr>
+      <w:r>
+        <w:rPr>
+          <w:rFonts w:ascii="Segoe UI Symbol" w:hAnsi="Segoe UI Symbol" w:cs="Segoe UI Symbol"/>
+          <w:b/>
+          <w:bCs/>
+        </w:rPr>
+        <w:t>✔</w:t>
+      </w:r>
+      <w:r>
+        <w:rPr>
+          <w:b/>
+          <w:bCs/>
+        </w:rPr>
+        <w:t xml:space="preserve"> 5. Auto-payment customers are less likely to churn</w:t>
+      </w:r>
+    </w:p>
+    <w:p>
+      <w:r>
+        <w:t>Seamless billing reduces friction and accidental churn.</w:t>
+      </w:r>
+    </w:p>
+    <w:p>
+      <w:r>
+        <w:t>These insights translate directly into business actions.</w:t>
+      </w:r>
+    </w:p>
+    <w:p>
+      <w:r>
+        <w:pict w14:anchorId="6E451326">
+          <v:rect id="_x0000_i1303" style="width:0;height:1.5pt" o:hralign="center" o:hrstd="t" o:hr="t" fillcolor="#a0a0a0" stroked="f"/>
+        </w:pict>
+      </w:r>
+    </w:p>
+    <w:p>
+      <w:pPr>
+        <w:pStyle w:val="Heading1"/>
+      </w:pPr>
+      <w:r>
+        <w:t>6. How the Model Works (Simple Explanation)</w:t>
+      </w:r>
+    </w:p>
+    <w:p>
+      <w:r>
+        <w:t>The system doesn’t use hard-coded rules.</w:t>
+      </w:r>
+      <w:r>
+        <w:br/>
+        <w:t xml:space="preserve">Instead, it </w:t>
+      </w:r>
+      <w:r>
+        <w:rPr>
+          <w:i/>
+          <w:iCs/>
+        </w:rPr>
+        <w:t>learns</w:t>
+      </w:r>
+      <w:r>
+        <w:t xml:space="preserve"> from historical data.</w:t>
+      </w:r>
+    </w:p>
+    <w:p>
+      <w:pPr>
+        <w:rPr>
+          <w:b/>
+          <w:bCs/>
+        </w:rPr>
+      </w:pPr>
+      <w:r>
+        <w:rPr>
+          <w:b/>
+          <w:bCs/>
+        </w:rPr>
+        <w:t>In simple terms:</w:t>
+      </w:r>
+    </w:p>
+    <w:p>
+      <w:pPr>
+        <w:numPr>
+          <w:ilvl w:val="0"/>
+          <w:numId w:val="9"/>
+        </w:numPr>
+      </w:pPr>
+      <w:r>
+        <w:t>It looks at thousands of past customers</w:t>
+      </w:r>
+    </w:p>
+    <w:p>
+      <w:pPr>
+        <w:numPr>
+          <w:ilvl w:val="0"/>
+          <w:numId w:val="9"/>
+        </w:numPr>
+      </w:pPr>
+      <w:r>
+        <w:t xml:space="preserve">Learns which </w:t>
+      </w:r>
+      <w:proofErr w:type="spellStart"/>
+      <w:r>
+        <w:t>behaviors</w:t>
+      </w:r>
+      <w:proofErr w:type="spellEnd"/>
+      <w:r>
+        <w:t xml:space="preserve"> commonly lead to churn</w:t>
+      </w:r>
+    </w:p>
+    <w:p>
+      <w:pPr>
+        <w:numPr>
+          <w:ilvl w:val="0"/>
+          <w:numId w:val="9"/>
+        </w:numPr>
+      </w:pPr>
+      <w:r>
+        <w:t>Applies the patterns to new customers</w:t>
+      </w:r>
+    </w:p>
+    <w:p>
+      <w:pPr>
+        <w:rPr>
+          <w:b/>
+          <w:bCs/>
+        </w:rPr>
+      </w:pPr>
+      <w:r>
+        <w:rPr>
+          <w:b/>
+          <w:bCs/>
+        </w:rPr>
+        <w:t>Output example:</w:t>
+      </w:r>
+    </w:p>
+    <w:p>
+      <w:r>
+        <w:t xml:space="preserve">“This customer has a </w:t>
+      </w:r>
+      <w:r>
+        <w:rPr>
+          <w:b/>
+          <w:bCs/>
+        </w:rPr>
+        <w:t>78% probability</w:t>
+      </w:r>
+      <w:r>
+        <w:t xml:space="preserve"> of churning.</w:t>
+      </w:r>
+      <w:r>
+        <w:br/>
+        <w:t>Top reasons:</w:t>
+      </w:r>
+    </w:p>
+    <w:p>
+      <w:pPr>
+        <w:numPr>
+          <w:ilvl w:val="0"/>
+          <w:numId w:val="10"/>
+        </w:numPr>
+      </w:pPr>
+      <w:r>
+        <w:t>Month-to-month contract</w:t>
+      </w:r>
+    </w:p>
+    <w:p>
+      <w:pPr>
+        <w:numPr>
+          <w:ilvl w:val="0"/>
+          <w:numId w:val="10"/>
+        </w:numPr>
+      </w:pPr>
+      <w:r>
+        <w:t>High monthly charges</w:t>
+      </w:r>
+    </w:p>
+    <w:p>
+      <w:pPr>
+        <w:numPr>
+          <w:ilvl w:val="0"/>
+          <w:numId w:val="10"/>
+        </w:numPr>
+      </w:pPr>
+      <w:r>
+        <w:t>No Tech Support subscription”</w:t>
+      </w:r>
+    </w:p>
+    <w:p>
+      <w:r>
+        <w:t xml:space="preserve">This helps business teams </w:t>
+      </w:r>
+      <w:r>
+        <w:rPr>
+          <w:b/>
+          <w:bCs/>
+        </w:rPr>
+        <w:t>take targeted retention steps</w:t>
+      </w:r>
+      <w:r>
+        <w:t>.</w:t>
+      </w:r>
+    </w:p>
+    <w:p>
+      <w:r>
+        <w:pict w14:anchorId="6AFC7BEF">
+          <v:rect id="_x0000_i1327" style="width:0;height:1.5pt" o:hralign="center" o:hrstd="t" o:hr="t" fillcolor="#a0a0a0" stroked="f"/>
+        </w:pict>
+      </w:r>
+    </w:p>
+    <w:p>
+      <w:pPr>
+        <w:pStyle w:val="Heading1"/>
+      </w:pPr>
+      <w:r>
+        <w:lastRenderedPageBreak/>
+        <w:t xml:space="preserve">7. </w:t>
+      </w:r>
+      <w:r>
+        <w:t>Architecture diagram</w:t>
+      </w:r>
+    </w:p>
+    <w:p>
+      <w:pPr>
+        <w:jc w:val="center"/>
+      </w:pPr>
+      <w:r>
+        <w:drawing>
+          <wp:inline distT="0" distB="0" distL="0" distR="0" wp14:anchorId="0027EA2E" wp14:editId="64A6A690">
+            <wp:extent cx="2903472" cy="4343776"/>
+            <wp:effectExtent l="19050" t="19050" r="11430" b="19050"/>
+            <wp:docPr id="172996179" name="Picture 1"/>
+            <wp:cNvGraphicFramePr>
+              <a:graphicFrameLocks xmlns:a="http://schemas.openxmlformats.org/drawingml/2006/main" noChangeAspect="1"/>
+            </wp:cNvGraphicFramePr>
+            <a:graphic xmlns:a="http://schemas.openxmlformats.org/drawingml/2006/main">
+              <a:graphicData uri="http://schemas.openxmlformats.org/drawingml/2006/picture">
+                <pic:pic xmlns:pic="http://schemas.openxmlformats.org/drawingml/2006/picture">
+                  <pic:nvPicPr>
+                    <pic:cNvPr id="172996179" name=""/>
+                    <pic:cNvPicPr/>
+                  </pic:nvPicPr>
+                  <pic:blipFill>
+                    <a:blip r:embed="rId5"/>
+                    <a:stretch>
+                      <a:fillRect/>
+                    </a:stretch>
+                  </pic:blipFill>
+                  <pic:spPr>
+                    <a:xfrm>
+                      <a:off x="0" y="0"/>
+                      <a:ext cx="2903472" cy="4343776"/>
+                    </a:xfrm>
+                    <a:prstGeom prst="rect">
+                      <a:avLst/>
+                    </a:prstGeom>
+                    <a:ln>
+                      <a:solidFill>
+                        <a:schemeClr val="accent1"/>
+                      </a:solidFill>
+                    </a:ln>
+                  </pic:spPr>
+                </pic:pic>
+              </a:graphicData>
+            </a:graphic>
+          </wp:inline>
+        </w:drawing>
+      </w:r>
+    </w:p>
+    <w:p>
+      <w:r>
+        <w:pict w14:anchorId="335CFCA1">
+          <v:rect id="_x0000_i1328" style="width:0;height:1.5pt" o:hralign="center" o:hrstd="t" o:hr="t" fillcolor="#a0a0a0" stroked="f"/>
+        </w:pict>
+      </w:r>
+    </w:p>
+    <w:p>
+      <w:pPr>
+        <w:pStyle w:val="Heading1"/>
+      </w:pPr>
+      <w:r>
+        <w:t>8</w:t>
+      </w:r>
+      <w:r>
+        <w:t>. Why This Model Is Trustworthy</w:t>
+      </w:r>
+    </w:p>
+    <w:p>
+      <w:r>
+        <w:t xml:space="preserve">To ensure transparency and fairness, the system uses </w:t>
+      </w:r>
+      <w:r>
+        <w:rPr>
+          <w:b/>
+          <w:bCs/>
+        </w:rPr>
+        <w:t>Explainable AI (SHAP)</w:t>
+      </w:r>
+      <w:r>
+        <w:t xml:space="preserve"> to:</w:t>
+      </w:r>
+    </w:p>
+    <w:p>
+      <w:pPr>
+        <w:numPr>
+          <w:ilvl w:val="0"/>
+          <w:numId w:val="11"/>
+        </w:numPr>
+      </w:pPr>
+      <w:r>
+        <w:t>Show which features influenced the prediction</w:t>
+      </w:r>
+    </w:p>
+    <w:p>
+      <w:pPr>
+        <w:numPr>
+          <w:ilvl w:val="0"/>
+          <w:numId w:val="11"/>
+        </w:numPr>
+      </w:pPr>
+      <w:r>
+        <w:t>Highlight positive/negative drivers</w:t>
+      </w:r>
+    </w:p>
+    <w:p>
+      <w:pPr>
+        <w:numPr>
+          <w:ilvl w:val="0"/>
+          <w:numId w:val="11"/>
+        </w:numPr>
+      </w:pPr>
+      <w:r>
+        <w:t>Ensure decisions are interpretable, not black-box</w:t>
+      </w:r>
+    </w:p>
+    <w:p>
+      <w:r>
+        <w:t>Leadership teams often hesitate to use ML due to “black-box anxiety.”</w:t>
+      </w:r>
+      <w:r>
+        <w:br/>
+        <w:t>Explainability solves that.</w:t>
+      </w:r>
+    </w:p>
+    <w:p>
+      <w:r>
+        <w:pict w14:anchorId="732B65A6">
+          <v:rect id="_x0000_i1305" style="width:0;height:1.5pt" o:hralign="center" o:hrstd="t" o:hr="t" fillcolor="#a0a0a0" stroked="f"/>
+        </w:pict>
+      </w:r>
+    </w:p>
+    <w:p>
+      <w:pPr>
+        <w:pStyle w:val="Heading1"/>
+      </w:pPr>
+      <w:r>
+        <w:t>9</w:t>
+      </w:r>
+      <w:r>
+        <w:t xml:space="preserve">. </w:t>
+      </w:r>
+      <w:proofErr w:type="spellStart"/>
+      <w:r>
+        <w:t>Streamlit</w:t>
+      </w:r>
+      <w:proofErr w:type="spellEnd"/>
+      <w:r>
+        <w:t xml:space="preserve"> Application (Business View)</w:t>
+      </w:r>
+    </w:p>
+    <w:p>
+      <w:r>
+        <w:t>The app lets non-technical users:</w:t>
+      </w:r>
+    </w:p>
+    <w:p>
+      <w:pPr>
+        <w:rPr>
+          <w:b/>
+          <w:bCs/>
+        </w:rPr>
+      </w:pPr>
+      <w:r>
+        <w:rPr>
+          <w:rFonts w:ascii="Segoe UI Symbol" w:hAnsi="Segoe UI Symbol" w:cs="Segoe UI Symbol"/>
+          <w:b/>
+          <w:bCs/>
+        </w:rPr>
+        <w:t>✔</w:t>
+      </w:r>
+      <w:r>
+        <w:rPr>
+          <w:b/>
+          <w:bCs/>
+        </w:rPr>
+        <w:t xml:space="preserve"> Enter customer details</w:t>
+      </w:r>
+    </w:p>
+    <w:p>
+      <w:pPr>
+        <w:rPr>
+          <w:b/>
+          <w:bCs/>
+        </w:rPr>
+      </w:pPr>
+      <w:r>
+        <w:rPr>
+          <w:rFonts w:ascii="Segoe UI Symbol" w:hAnsi="Segoe UI Symbol" w:cs="Segoe UI Symbol"/>
+          <w:b/>
+          <w:bCs/>
+        </w:rPr>
+        <w:t>✔</w:t>
+      </w:r>
+      <w:r>
+        <w:rPr>
+          <w:b/>
+          <w:bCs/>
+        </w:rPr>
+        <w:t xml:space="preserve"> Get instant churn risk</w:t>
+      </w:r>
+    </w:p>
+    <w:p>
+      <w:pPr>
+        <w:rPr>
+          <w:b/>
+          <w:bCs/>
+        </w:rPr>
+      </w:pPr>
+      <w:r>
+        <w:rPr>
+          <w:rFonts w:ascii="Segoe UI Symbol" w:hAnsi="Segoe UI Symbol" w:cs="Segoe UI Symbol"/>
+          <w:b/>
+          <w:bCs/>
+        </w:rPr>
+        <w:t>✔</w:t>
+      </w:r>
+      <w:r>
+        <w:rPr>
+          <w:b/>
+          <w:bCs/>
+        </w:rPr>
+        <w:t xml:space="preserve"> View clear actionable insights</w:t>
+      </w:r>
+    </w:p>
+    <w:p>
+      <w:r>
+        <w:t>This helps:</w:t>
+      </w:r>
+    </w:p>
+    <w:p>
+      <w:pPr>
+        <w:numPr>
+          <w:ilvl w:val="0"/>
+          <w:numId w:val="12"/>
+        </w:numPr>
+      </w:pPr>
+      <w:r>
+        <w:t>Retention teams prioritize customers</w:t>
+      </w:r>
+    </w:p>
+    <w:p>
+      <w:pPr>
+        <w:numPr>
+          <w:ilvl w:val="0"/>
+          <w:numId w:val="12"/>
+        </w:numPr>
+      </w:pPr>
+      <w:r>
+        <w:lastRenderedPageBreak/>
+        <w:t>Support agents tailor offers</w:t>
+      </w:r>
+    </w:p>
+    <w:p>
+      <w:pPr>
+        <w:numPr>
+          <w:ilvl w:val="0"/>
+          <w:numId w:val="12"/>
+        </w:numPr>
+      </w:pPr>
+      <w:r>
+        <w:t>Managers plan campaigns</w:t>
+      </w:r>
+    </w:p>
+    <w:p>
+      <w:pPr>
+        <w:numPr>
+          <w:ilvl w:val="0"/>
+          <w:numId w:val="12"/>
+        </w:numPr>
+      </w:pPr>
+      <w:r>
+        <w:t>Leadership monitor churn patterns</w:t>
+      </w:r>
+    </w:p>
+    <w:p>
+      <w:r>
+        <w:t xml:space="preserve">The app is simple enough for </w:t>
+      </w:r>
+      <w:r>
+        <w:rPr>
+          <w:b/>
+          <w:bCs/>
+        </w:rPr>
+        <w:t>anyone</w:t>
+      </w:r>
+      <w:r>
+        <w:t xml:space="preserve"> to use.</w:t>
+      </w:r>
+    </w:p>
+    <w:p>
+      <w:r>
+        <w:pict w14:anchorId="62E78BD0">
+          <v:rect id="_x0000_i1306" style="width:0;height:1.5pt" o:hralign="center" o:hrstd="t" o:hr="t" fillcolor="#a0a0a0" stroked="f"/>
+        </w:pict>
+      </w:r>
+    </w:p>
+    <w:p>
+      <w:pPr>
+        <w:pStyle w:val="Heading1"/>
+      </w:pPr>
+      <w:r>
+        <w:t>10</w:t>
+      </w:r>
+      <w:r>
+        <w:t>. Business Impact (High-Level)</w:t>
+      </w:r>
+    </w:p>
+    <w:p>
+      <w:r>
+        <w:t>If deployed as part of a retention workflow, this solution can help:</w:t>
+      </w:r>
+    </w:p>
+    <w:p>
+      <w:pPr>
+        <w:rPr>
+          <w:b/>
+          <w:bCs/>
+        </w:rPr>
+      </w:pPr>
+      <w:r>
+        <w:rPr>
+          <w:rFonts w:ascii="Segoe UI Emoji" w:hAnsi="Segoe UI Emoji" w:cs="Segoe UI Emoji"/>
+          <w:b/>
+          <w:bCs/>
+        </w:rPr>
+        <w:t>⭐</w:t>
+      </w:r>
+      <w:r>
+        <w:rPr>
+          <w:b/>
+          <w:bCs/>
+        </w:rPr>
+        <w:t xml:space="preserve"> Increase retention by 10–30%</w:t>
+      </w:r>
+    </w:p>
+    <w:p>
+      <w:r>
+        <w:t>(by targeting high-risk segments)</w:t>
+      </w:r>
+    </w:p>
+    <w:p>
+      <w:pPr>
+        <w:rPr>
+          <w:b/>
+          <w:bCs/>
+        </w:rPr>
+      </w:pPr>
+      <w:r>
+        <w:rPr>
+          <w:rFonts w:ascii="Segoe UI Emoji" w:hAnsi="Segoe UI Emoji" w:cs="Segoe UI Emoji"/>
+          <w:b/>
+          <w:bCs/>
+        </w:rPr>
+        <w:t>⭐</w:t>
+      </w:r>
+      <w:r>
+        <w:rPr>
+          <w:b/>
+          <w:bCs/>
+        </w:rPr>
+        <w:t xml:space="preserve"> Reduce marketing costs</w:t>
+      </w:r>
+    </w:p>
+    <w:p>
+      <w:r>
+        <w:t>(by focusing incentives only on at-risk customers)</w:t>
+      </w:r>
+    </w:p>
+    <w:p>
+      <w:pPr>
+        <w:rPr>
+          <w:b/>
+          <w:bCs/>
+        </w:rPr>
+      </w:pPr>
+      <w:r>
+        <w:rPr>
+          <w:rFonts w:ascii="Segoe UI Emoji" w:hAnsi="Segoe UI Emoji" w:cs="Segoe UI Emoji"/>
+          <w:b/>
+          <w:bCs/>
+        </w:rPr>
+        <w:t>⭐</w:t>
+      </w:r>
+      <w:r>
+        <w:rPr>
+          <w:b/>
+          <w:bCs/>
+        </w:rPr>
+        <w:t xml:space="preserve"> Improve customer satisfaction</w:t>
+      </w:r>
+    </w:p>
+    <w:p>
+      <w:r>
+        <w:t>(by proactive outreach)</w:t>
+      </w:r>
+    </w:p>
+    <w:p>
+      <w:pPr>
+        <w:rPr>
+          <w:b/>
+          <w:bCs/>
+        </w:rPr>
+      </w:pPr>
+      <w:r>
+        <w:rPr>
+          <w:rFonts w:ascii="Segoe UI Emoji" w:hAnsi="Segoe UI Emoji" w:cs="Segoe UI Emoji"/>
+          <w:b/>
+          <w:bCs/>
+        </w:rPr>
+        <w:t>⭐</w:t>
+      </w:r>
+      <w:r>
+        <w:rPr>
+          <w:b/>
+          <w:bCs/>
+        </w:rPr>
+        <w:t xml:space="preserve"> Strengthen executive decision-making</w:t>
+      </w:r>
+    </w:p>
+    <w:p>
+      <w:r>
+        <w:t>(by providing data-driven insights)</w:t>
+      </w:r>
+    </w:p>
+    <w:p>
+      <w:r>
+        <w:t>Even as a prototype, the system demonstrates the value of ML-driven retention.</w:t>
+      </w:r>
+    </w:p>
+    <w:p>
+      <w:r>
+        <w:pict w14:anchorId="67EB83CD">
+          <v:rect id="_x0000_i1307" style="width:0;height:1.5pt" o:hralign="center" o:hrstd="t" o:hr="t" fillcolor="#a0a0a0" stroked="f"/>
+        </w:pict>
+      </w:r>
+    </w:p>
+    <w:p>
+      <w:pPr>
+        <w:pStyle w:val="Heading1"/>
+      </w:pPr>
+      <w:r>
+        <w:t>1</w:t>
+      </w:r>
+      <w:r>
+        <w:t>1</w:t>
+      </w:r>
+      <w:r>
+        <w:t>. Limitations &amp; Future Enhancements (Executive View)</w:t>
+      </w:r>
+    </w:p>
+    <w:p>
+      <w:pPr>
+        <w:rPr>
+          <w:b/>
+          <w:bCs/>
+        </w:rPr>
+      </w:pPr>
+      <w:r>
+        <w:rPr>
+          <w:rFonts w:ascii="Segoe UI Emoji" w:hAnsi="Segoe UI Emoji" w:cs="Segoe UI Emoji"/>
+          <w:b/>
+          <w:bCs/>
+        </w:rPr>
+        <w:t>🔸</w:t>
+      </w:r>
+      <w:r>
+        <w:rPr>
+          <w:b/>
+          <w:bCs/>
+        </w:rPr>
+        <w:t xml:space="preserve"> Limitations</w:t>
+      </w:r>
+    </w:p>
+    <w:p>
+      <w:pPr>
+        <w:numPr>
+          <w:ilvl w:val="0"/>
+          <w:numId w:val="13"/>
+        </w:numPr>
+      </w:pPr>
+      <w:r>
+        <w:t>Dataset is a sample; real companies may need millions of rows.</w:t>
+      </w:r>
+    </w:p>
+    <w:p>
+      <w:pPr>
+        <w:numPr>
+          <w:ilvl w:val="0"/>
+          <w:numId w:val="13"/>
+        </w:numPr>
+      </w:pPr>
+      <w:r>
+        <w:t>No real-time integration with billing systems.</w:t>
+      </w:r>
+    </w:p>
+    <w:p>
+      <w:pPr>
+        <w:numPr>
+          <w:ilvl w:val="0"/>
+          <w:numId w:val="13"/>
+        </w:numPr>
+      </w:pPr>
+      <w:r>
+        <w:t>Predictions depend on input data quality.</w:t>
+      </w:r>
+    </w:p>
+    <w:p>
+      <w:r>
+        <w:pict w14:anchorId="512C3620">
+          <v:rect id="_x0000_i1308" style="width:0;height:1.5pt" o:hralign="center" o:hrstd="t" o:hr="t" fillcolor="#a0a0a0" stroked="f"/>
+        </w:pict>
+      </w:r>
+    </w:p>
+    <w:p>
+      <w:pPr>
+        <w:rPr>
+          <w:b/>
+          <w:bCs/>
+        </w:rPr>
+      </w:pPr>
+      <w:r>
+        <w:rPr>
+          <w:rFonts w:ascii="Segoe UI Emoji" w:hAnsi="Segoe UI Emoji" w:cs="Segoe UI Emoji"/>
+          <w:b/>
+          <w:bCs/>
+        </w:rPr>
+        <w:t>🔹</w:t>
+      </w:r>
+      <w:r>
+        <w:rPr>
+          <w:b/>
+          <w:bCs/>
+        </w:rPr>
+        <w:t xml:space="preserve"> Future Enhancements</w:t>
+      </w:r>
+    </w:p>
+    <w:p>
+      <w:pPr>
+        <w:numPr>
+          <w:ilvl w:val="0"/>
+          <w:numId w:val="14"/>
+        </w:numPr>
+      </w:pPr>
+      <w:r>
+        <w:t>Retraining pipeline for real-time data</w:t>
+      </w:r>
+    </w:p>
+    <w:p>
+      <w:pPr>
+        <w:numPr>
+          <w:ilvl w:val="0"/>
+          <w:numId w:val="14"/>
+        </w:numPr>
+      </w:pPr>
+      <w:r>
+        <w:t>API integration for CRM systems</w:t>
+      </w:r>
+    </w:p>
+    <w:p>
+      <w:pPr>
+        <w:numPr>
+          <w:ilvl w:val="0"/>
+          <w:numId w:val="14"/>
+        </w:numPr>
+      </w:pPr>
+      <w:r>
+        <w:t>Dynamic customer segmentation</w:t>
+      </w:r>
+    </w:p>
+    <w:p>
+      <w:pPr>
+        <w:numPr>
+          <w:ilvl w:val="0"/>
+          <w:numId w:val="14"/>
+        </w:numPr>
+      </w:pPr>
+      <w:r>
+        <w:t>Incorporate customer sentiment (calls, emails, chat data)</w:t>
+      </w:r>
+    </w:p>
+    <w:p>
+      <w:pPr>
+        <w:numPr>
+          <w:ilvl w:val="0"/>
+          <w:numId w:val="14"/>
+        </w:numPr>
+      </w:pPr>
+      <w:r>
+        <w:t>Automated retention recommendations (discount vs outreach vs upsell)</w:t>
+      </w:r>
+    </w:p>
+    <w:p>
+      <w:r>
+        <w:pict w14:anchorId="28253D9F">
+          <v:rect id="_x0000_i1309" style="width:0;height:1.5pt" o:hralign="center" o:hrstd="t" o:hr="t" fillcolor="#a0a0a0" stroked="f"/>
+        </w:pict>
+      </w:r>
+    </w:p>
+    <w:p>
+      <w:pPr>
+        <w:pStyle w:val="Heading1"/>
+      </w:pPr>
+      <w:r>
+        <w:lastRenderedPageBreak/>
+        <w:t>1</w:t>
+      </w:r>
+      <w:r>
+        <w:t>2</w:t>
+      </w:r>
+      <w:r>
+        <w:t>. Conclusion (Leadership Summary)</w:t>
+      </w:r>
+    </w:p>
+    <w:p>
+      <w:r>
+        <w:t>This project shows how Machine Learning can:</w:t>
+      </w:r>
+    </w:p>
+    <w:p>
+      <w:pPr>
+        <w:numPr>
+          <w:ilvl w:val="0"/>
+          <w:numId w:val="15"/>
+        </w:numPr>
+      </w:pPr>
+      <w:r>
+        <w:t>Detect early churn signs</w:t>
+      </w:r>
+    </w:p>
+    <w:p>
+      <w:pPr>
+        <w:numPr>
+          <w:ilvl w:val="0"/>
+          <w:numId w:val="15"/>
+        </w:numPr>
+      </w:pPr>
+      <w:r>
+        <w:t xml:space="preserve">Identify key </w:t>
+      </w:r>
+      <w:proofErr w:type="spellStart"/>
+      <w:r>
+        <w:t>behavioral</w:t>
+      </w:r>
+      <w:proofErr w:type="spellEnd"/>
+      <w:r>
+        <w:t xml:space="preserve"> drivers</w:t>
+      </w:r>
+    </w:p>
+    <w:p>
+      <w:pPr>
+        <w:numPr>
+          <w:ilvl w:val="0"/>
+          <w:numId w:val="15"/>
+        </w:numPr>
+      </w:pPr>
+      <w:r>
+        <w:t>Enable targeted interventions</w:t>
+      </w:r>
+    </w:p>
+    <w:p>
+      <w:pPr>
+        <w:numPr>
+          <w:ilvl w:val="0"/>
+          <w:numId w:val="15"/>
+        </w:numPr>
+      </w:pPr>
+      <w:r>
+        <w:t>Provide actionable insights to reduce revenue loss</w:t>
+      </w:r>
+    </w:p>
+    <w:p>
+      <w:r>
+        <w:t xml:space="preserve">It bridges </w:t>
+      </w:r>
+      <w:r>
+        <w:rPr>
+          <w:b/>
+          <w:bCs/>
+        </w:rPr>
+        <w:t xml:space="preserve">technical ML </w:t>
+      </w:r>
+      <w:proofErr w:type="spellStart"/>
+      <w:r>
+        <w:rPr>
+          <w:b/>
+          <w:bCs/>
+        </w:rPr>
+        <w:t>modeling</w:t>
+      </w:r>
+      <w:proofErr w:type="spellEnd"/>
+      <w:r>
+        <w:t xml:space="preserve"> with </w:t>
+      </w:r>
+      <w:r>
+        <w:rPr>
+          <w:b/>
+          <w:bCs/>
+        </w:rPr>
+        <w:t>business value creation</w:t>
+      </w:r>
+      <w:r>
+        <w:t>, demonstrating end-to-end ownership from data processing to a client-ready application.</w:t>
       </w:r>
     </w:p>
     <w:p/>
@@ -172,6 +2013,304 @@
 <file path=word/numbering.xml><?xml version="1.0" encoding="utf-8"?>
 <w:numbering xmlns:wpc="http://schemas.microsoft.com/office/word/2010/wordprocessingCanvas" xmlns:cx="http://schemas.microsoft.com/office/drawing/2014/chartex" xmlns:cx1="http://schemas.microsoft.com/office/drawing/2015/9/8/chartex" xmlns:cx2="http://schemas.microsoft.com/office/drawing/2015/10/21/chartex" xmlns:cx3="http://schemas.microsoft.com/office/drawing/2016/5/9/chartex" xmlns:cx4="http://schemas.microsoft.com/office/drawing/2016/5/10/chartex" xmlns:cx5="http://schemas.microsoft.com/office/drawing/2016/5/11/chartex" xmlns:cx6="http://schemas.microsoft.com/office/drawing/2016/5/12/chartex" xmlns:cx7="http://schemas.microsoft.com/office/drawing/2016/5/13/chartex" xmlns:cx8="http://schemas.microsoft.com/office/drawing/2016/5/14/chartex" xmlns:mc="http://schemas.openxmlformats.org/markup-compatibility/2006" xmlns:aink="http://schemas.microsoft.com/office/drawing/2016/ink" xmlns:am3d="http://schemas.microsoft.com/office/drawing/2017/model3d" xmlns:o="urn:schemas-microsoft-com:office:office" xmlns:oel="http://schemas.microsoft.com/office/2019/extlst" xmlns:r="http://schemas.openxmlformats.org/officeDocument/2006/relationships" xmlns:m="http://schemas.openxmlformats.org/officeDocument/2006/math" xmlns:v="urn:schemas-microsoft-com:vml" xmlns:wp14="http://schemas.microsoft.com/office/word/2010/wordprocessingDrawing" xmlns:wp="http://schemas.openxmlformats.org/drawingml/2006/wordprocessingDrawing" xmlns:w10="urn:schemas-microsoft-com:office:word" xmlns:w="http://schemas.openxmlformats.org/wordprocessingml/2006/main" xmlns:w14="http://schemas.microsoft.com/office/word/2010/wordml" xmlns:w15="http://schemas.microsoft.com/office/word/2012/wordml" xmlns:w16cex="http://schemas.microsoft.com/office/word/2018/wordml/cex" xmlns:w16cid="http://schemas.microsoft.com/office/word/2016/wordml/cid" xmlns:w16="http://schemas.microsoft.com/office/word/2018/wordml" xmlns:w16du="http://schemas.microsoft.com/office/word/2023/wordml/word16du" xmlns:w16sdtdh="http://schemas.microsoft.com/office/word/2020/wordml/sdtdatahash" xmlns:w16sdtfl="http://schemas.microsoft.com/office/word/2024/wordml/sdtformatlock" xmlns:w16se="http://schemas.microsoft.com/office/word/2015/wordml/symex" xmlns:wpg="http://schemas.microsoft.com/office/word/2010/wordprocessingGroup" xmlns:wpi="http://schemas.microsoft.com/office/word/2010/wordprocessingInk" xmlns:wne="http://schemas.microsoft.com/office/word/2006/wordml" xmlns:wps="http://schemas.microsoft.com/office/word/2010/wordprocessingShape" mc:Ignorable="w14 w15 w16se w16cid w16 w16cex w16sdtdh w16sdtfl w16du wp14">
   <w:abstractNum w:abstractNumId="0" w15:restartNumberingAfterBreak="0">
+    <w:nsid w:val="02151B78"/>
+    <w:multiLevelType w:val="multilevel"/>
+    <w:tmpl w:val="16CAC8DC"/>
+    <w:lvl w:ilvl="0">
+      <w:start w:val="1"/>
+      <w:numFmt w:val="bullet"/>
+      <w:lvlText w:val=""/>
+      <w:lvlJc w:val="left"/>
+      <w:pPr>
+        <w:tabs>
+          <w:tab w:val="num" w:pos="720"/>
+        </w:tabs>
+        <w:ind w:left="720" w:hanging="360"/>
+      </w:pPr>
+      <w:rPr>
+        <w:rFonts w:ascii="Symbol" w:hAnsi="Symbol" w:hint="default"/>
+        <w:sz w:val="20"/>
+      </w:rPr>
+    </w:lvl>
+    <w:lvl w:ilvl="1" w:tentative="1">
+      <w:start w:val="1"/>
+      <w:numFmt w:val="bullet"/>
+      <w:lvlText w:val="o"/>
+      <w:lvlJc w:val="left"/>
+      <w:pPr>
+        <w:tabs>
+          <w:tab w:val="num" w:pos="1440"/>
+        </w:tabs>
+        <w:ind w:left="1440" w:hanging="360"/>
+      </w:pPr>
+      <w:rPr>
+        <w:rFonts w:ascii="Courier New" w:hAnsi="Courier New" w:hint="default"/>
+        <w:sz w:val="20"/>
+      </w:rPr>
+    </w:lvl>
+    <w:lvl w:ilvl="2" w:tentative="1">
+      <w:start w:val="1"/>
+      <w:numFmt w:val="bullet"/>
+      <w:lvlText w:val=""/>
+      <w:lvlJc w:val="left"/>
+      <w:pPr>
+        <w:tabs>
+          <w:tab w:val="num" w:pos="2160"/>
+        </w:tabs>
+        <w:ind w:left="2160" w:hanging="360"/>
+      </w:pPr>
+      <w:rPr>
+        <w:rFonts w:ascii="Wingdings" w:hAnsi="Wingdings" w:hint="default"/>
+        <w:sz w:val="20"/>
+      </w:rPr>
+    </w:lvl>
+    <w:lvl w:ilvl="3" w:tentative="1">
+      <w:start w:val="1"/>
+      <w:numFmt w:val="bullet"/>
+      <w:lvlText w:val=""/>
+      <w:lvlJc w:val="left"/>
+      <w:pPr>
+        <w:tabs>
+          <w:tab w:val="num" w:pos="2880"/>
+        </w:tabs>
+        <w:ind w:left="2880" w:hanging="360"/>
+      </w:pPr>
+      <w:rPr>
+        <w:rFonts w:ascii="Wingdings" w:hAnsi="Wingdings" w:hint="default"/>
+        <w:sz w:val="20"/>
+      </w:rPr>
+    </w:lvl>
+    <w:lvl w:ilvl="4" w:tentative="1">
+      <w:start w:val="1"/>
+      <w:numFmt w:val="bullet"/>
+      <w:lvlText w:val=""/>
+      <w:lvlJc w:val="left"/>
+      <w:pPr>
+        <w:tabs>
+          <w:tab w:val="num" w:pos="3600"/>
+        </w:tabs>
+        <w:ind w:left="3600" w:hanging="360"/>
+      </w:pPr>
+      <w:rPr>
+        <w:rFonts w:ascii="Wingdings" w:hAnsi="Wingdings" w:hint="default"/>
+        <w:sz w:val="20"/>
+      </w:rPr>
+    </w:lvl>
+    <w:lvl w:ilvl="5" w:tentative="1">
+      <w:start w:val="1"/>
+      <w:numFmt w:val="bullet"/>
+      <w:lvlText w:val=""/>
+      <w:lvlJc w:val="left"/>
+      <w:pPr>
+        <w:tabs>
+          <w:tab w:val="num" w:pos="4320"/>
+        </w:tabs>
+        <w:ind w:left="4320" w:hanging="360"/>
+      </w:pPr>
+      <w:rPr>
+        <w:rFonts w:ascii="Wingdings" w:hAnsi="Wingdings" w:hint="default"/>
+        <w:sz w:val="20"/>
+      </w:rPr>
+    </w:lvl>
+    <w:lvl w:ilvl="6" w:tentative="1">
+      <w:start w:val="1"/>
+      <w:numFmt w:val="bullet"/>
+      <w:lvlText w:val=""/>
+      <w:lvlJc w:val="left"/>
+      <w:pPr>
+        <w:tabs>
+          <w:tab w:val="num" w:pos="5040"/>
+        </w:tabs>
+        <w:ind w:left="5040" w:hanging="360"/>
+      </w:pPr>
+      <w:rPr>
+        <w:rFonts w:ascii="Wingdings" w:hAnsi="Wingdings" w:hint="default"/>
+        <w:sz w:val="20"/>
+      </w:rPr>
+    </w:lvl>
+    <w:lvl w:ilvl="7" w:tentative="1">
+      <w:start w:val="1"/>
+      <w:numFmt w:val="bullet"/>
+      <w:lvlText w:val=""/>
+      <w:lvlJc w:val="left"/>
+      <w:pPr>
+        <w:tabs>
+          <w:tab w:val="num" w:pos="5760"/>
+        </w:tabs>
+        <w:ind w:left="5760" w:hanging="360"/>
+      </w:pPr>
+      <w:rPr>
+        <w:rFonts w:ascii="Wingdings" w:hAnsi="Wingdings" w:hint="default"/>
+        <w:sz w:val="20"/>
+      </w:rPr>
+    </w:lvl>
+    <w:lvl w:ilvl="8" w:tentative="1">
+      <w:start w:val="1"/>
+      <w:numFmt w:val="bullet"/>
+      <w:lvlText w:val=""/>
+      <w:lvlJc w:val="left"/>
+      <w:pPr>
+        <w:tabs>
+          <w:tab w:val="num" w:pos="6480"/>
+        </w:tabs>
+        <w:ind w:left="6480" w:hanging="360"/>
+      </w:pPr>
+      <w:rPr>
+        <w:rFonts w:ascii="Wingdings" w:hAnsi="Wingdings" w:hint="default"/>
+        <w:sz w:val="20"/>
+      </w:rPr>
+    </w:lvl>
+  </w:abstractNum>
+  <w:abstractNum w:abstractNumId="1" w15:restartNumberingAfterBreak="0">
+    <w:nsid w:val="025E0230"/>
+    <w:multiLevelType w:val="multilevel"/>
+    <w:tmpl w:val="275AFD68"/>
+    <w:lvl w:ilvl="0">
+      <w:start w:val="1"/>
+      <w:numFmt w:val="bullet"/>
+      <w:lvlText w:val=""/>
+      <w:lvlJc w:val="left"/>
+      <w:pPr>
+        <w:tabs>
+          <w:tab w:val="num" w:pos="720"/>
+        </w:tabs>
+        <w:ind w:left="720" w:hanging="360"/>
+      </w:pPr>
+      <w:rPr>
+        <w:rFonts w:ascii="Symbol" w:hAnsi="Symbol" w:hint="default"/>
+        <w:sz w:val="20"/>
+      </w:rPr>
+    </w:lvl>
+    <w:lvl w:ilvl="1" w:tentative="1">
+      <w:start w:val="1"/>
+      <w:numFmt w:val="bullet"/>
+      <w:lvlText w:val="o"/>
+      <w:lvlJc w:val="left"/>
+      <w:pPr>
+        <w:tabs>
+          <w:tab w:val="num" w:pos="1440"/>
+        </w:tabs>
+        <w:ind w:left="1440" w:hanging="360"/>
+      </w:pPr>
+      <w:rPr>
+        <w:rFonts w:ascii="Courier New" w:hAnsi="Courier New" w:hint="default"/>
+        <w:sz w:val="20"/>
+      </w:rPr>
+    </w:lvl>
+    <w:lvl w:ilvl="2" w:tentative="1">
+      <w:start w:val="1"/>
+      <w:numFmt w:val="bullet"/>
+      <w:lvlText w:val=""/>
+      <w:lvlJc w:val="left"/>
+      <w:pPr>
+        <w:tabs>
+          <w:tab w:val="num" w:pos="2160"/>
+        </w:tabs>
+        <w:ind w:left="2160" w:hanging="360"/>
+      </w:pPr>
+      <w:rPr>
+        <w:rFonts w:ascii="Wingdings" w:hAnsi="Wingdings" w:hint="default"/>
+        <w:sz w:val="20"/>
+      </w:rPr>
+    </w:lvl>
+    <w:lvl w:ilvl="3" w:tentative="1">
+      <w:start w:val="1"/>
+      <w:numFmt w:val="bullet"/>
+      <w:lvlText w:val=""/>
+      <w:lvlJc w:val="left"/>
+      <w:pPr>
+        <w:tabs>
+          <w:tab w:val="num" w:pos="2880"/>
+        </w:tabs>
+        <w:ind w:left="2880" w:hanging="360"/>
+      </w:pPr>
+      <w:rPr>
+        <w:rFonts w:ascii="Wingdings" w:hAnsi="Wingdings" w:hint="default"/>
+        <w:sz w:val="20"/>
+      </w:rPr>
+    </w:lvl>
+    <w:lvl w:ilvl="4" w:tentative="1">
+      <w:start w:val="1"/>
+      <w:numFmt w:val="bullet"/>
+      <w:lvlText w:val=""/>
+      <w:lvlJc w:val="left"/>
+      <w:pPr>
+        <w:tabs>
+          <w:tab w:val="num" w:pos="3600"/>
+        </w:tabs>
+        <w:ind w:left="3600" w:hanging="360"/>
+      </w:pPr>
+      <w:rPr>
+        <w:rFonts w:ascii="Wingdings" w:hAnsi="Wingdings" w:hint="default"/>
+        <w:sz w:val="20"/>
+      </w:rPr>
+    </w:lvl>
+    <w:lvl w:ilvl="5" w:tentative="1">
+      <w:start w:val="1"/>
+      <w:numFmt w:val="bullet"/>
+      <w:lvlText w:val=""/>
+      <w:lvlJc w:val="left"/>
+      <w:pPr>
+        <w:tabs>
+          <w:tab w:val="num" w:pos="4320"/>
+        </w:tabs>
+        <w:ind w:left="4320" w:hanging="360"/>
+      </w:pPr>
+      <w:rPr>
+        <w:rFonts w:ascii="Wingdings" w:hAnsi="Wingdings" w:hint="default"/>
+        <w:sz w:val="20"/>
+      </w:rPr>
+    </w:lvl>
+    <w:lvl w:ilvl="6" w:tentative="1">
+      <w:start w:val="1"/>
+      <w:numFmt w:val="bullet"/>
+      <w:lvlText w:val=""/>
+      <w:lvlJc w:val="left"/>
+      <w:pPr>
+        <w:tabs>
+          <w:tab w:val="num" w:pos="5040"/>
+        </w:tabs>
+        <w:ind w:left="5040" w:hanging="360"/>
+      </w:pPr>
+      <w:rPr>
+        <w:rFonts w:ascii="Wingdings" w:hAnsi="Wingdings" w:hint="default"/>
+        <w:sz w:val="20"/>
+      </w:rPr>
+    </w:lvl>
+    <w:lvl w:ilvl="7" w:tentative="1">
+      <w:start w:val="1"/>
+      <w:numFmt w:val="bullet"/>
+      <w:lvlText w:val=""/>
+      <w:lvlJc w:val="left"/>
+      <w:pPr>
+        <w:tabs>
+          <w:tab w:val="num" w:pos="5760"/>
+        </w:tabs>
+        <w:ind w:left="5760" w:hanging="360"/>
+      </w:pPr>
+      <w:rPr>
+        <w:rFonts w:ascii="Wingdings" w:hAnsi="Wingdings" w:hint="default"/>
+        <w:sz w:val="20"/>
+      </w:rPr>
+    </w:lvl>
+    <w:lvl w:ilvl="8" w:tentative="1">
+      <w:start w:val="1"/>
+      <w:numFmt w:val="bullet"/>
+      <w:lvlText w:val=""/>
+      <w:lvlJc w:val="left"/>
+      <w:pPr>
+        <w:tabs>
+          <w:tab w:val="num" w:pos="6480"/>
+        </w:tabs>
+        <w:ind w:left="6480" w:hanging="360"/>
+      </w:pPr>
+      <w:rPr>
+        <w:rFonts w:ascii="Wingdings" w:hAnsi="Wingdings" w:hint="default"/>
+        <w:sz w:val="20"/>
+      </w:rPr>
+    </w:lvl>
+  </w:abstractNum>
+  <w:abstractNum w:abstractNumId="2" w15:restartNumberingAfterBreak="0">
     <w:nsid w:val="03981BB9"/>
     <w:multiLevelType w:val="hybridMultilevel"/>
     <w:tmpl w:val="72106DD2"/>
@@ -284,7 +2423,156 @@
       </w:rPr>
     </w:lvl>
   </w:abstractNum>
-  <w:abstractNum w:abstractNumId="1" w15:restartNumberingAfterBreak="0">
+  <w:abstractNum w:abstractNumId="3" w15:restartNumberingAfterBreak="0">
+    <w:nsid w:val="049A47AB"/>
+    <w:multiLevelType w:val="multilevel"/>
+    <w:tmpl w:val="5B728F66"/>
+    <w:lvl w:ilvl="0">
+      <w:start w:val="1"/>
+      <w:numFmt w:val="bullet"/>
+      <w:lvlText w:val=""/>
+      <w:lvlJc w:val="left"/>
+      <w:pPr>
+        <w:tabs>
+          <w:tab w:val="num" w:pos="720"/>
+        </w:tabs>
+        <w:ind w:left="720" w:hanging="360"/>
+      </w:pPr>
+      <w:rPr>
+        <w:rFonts w:ascii="Symbol" w:hAnsi="Symbol" w:hint="default"/>
+        <w:sz w:val="20"/>
+      </w:rPr>
+    </w:lvl>
+    <w:lvl w:ilvl="1" w:tentative="1">
+      <w:start w:val="1"/>
+      <w:numFmt w:val="bullet"/>
+      <w:lvlText w:val="o"/>
+      <w:lvlJc w:val="left"/>
+      <w:pPr>
+        <w:tabs>
+          <w:tab w:val="num" w:pos="1440"/>
+        </w:tabs>
+        <w:ind w:left="1440" w:hanging="360"/>
+      </w:pPr>
+      <w:rPr>
+        <w:rFonts w:ascii="Courier New" w:hAnsi="Courier New" w:hint="default"/>
+        <w:sz w:val="20"/>
+      </w:rPr>
+    </w:lvl>
+    <w:lvl w:ilvl="2" w:tentative="1">
+      <w:start w:val="1"/>
+      <w:numFmt w:val="bullet"/>
+      <w:lvlText w:val=""/>
+      <w:lvlJc w:val="left"/>
+      <w:pPr>
+        <w:tabs>
+          <w:tab w:val="num" w:pos="2160"/>
+        </w:tabs>
+        <w:ind w:left="2160" w:hanging="360"/>
+      </w:pPr>
+      <w:rPr>
+        <w:rFonts w:ascii="Wingdings" w:hAnsi="Wingdings" w:hint="default"/>
+        <w:sz w:val="20"/>
+      </w:rPr>
+    </w:lvl>
+    <w:lvl w:ilvl="3" w:tentative="1">
+      <w:start w:val="1"/>
+      <w:numFmt w:val="bullet"/>
+      <w:lvlText w:val=""/>
+      <w:lvlJc w:val="left"/>
+      <w:pPr>
+        <w:tabs>
+          <w:tab w:val="num" w:pos="2880"/>
+        </w:tabs>
+        <w:ind w:left="2880" w:hanging="360"/>
+      </w:pPr>
+      <w:rPr>
+        <w:rFonts w:ascii="Wingdings" w:hAnsi="Wingdings" w:hint="default"/>
+        <w:sz w:val="20"/>
+      </w:rPr>
+    </w:lvl>
+    <w:lvl w:ilvl="4" w:tentative="1">
+      <w:start w:val="1"/>
+      <w:numFmt w:val="bullet"/>
+      <w:lvlText w:val=""/>
+      <w:lvlJc w:val="left"/>
+      <w:pPr>
+        <w:tabs>
+          <w:tab w:val="num" w:pos="3600"/>
+        </w:tabs>
+        <w:ind w:left="3600" w:hanging="360"/>
+      </w:pPr>
+      <w:rPr>
+        <w:rFonts w:ascii="Wingdings" w:hAnsi="Wingdings" w:hint="default"/>
+        <w:sz w:val="20"/>
+      </w:rPr>
+    </w:lvl>
+    <w:lvl w:ilvl="5" w:tentative="1">
+      <w:start w:val="1"/>
+      <w:numFmt w:val="bullet"/>
+      <w:lvlText w:val=""/>
+      <w:lvlJc w:val="left"/>
+      <w:pPr>
+        <w:tabs>
+          <w:tab w:val="num" w:pos="4320"/>
+        </w:tabs>
+        <w:ind w:left="4320" w:hanging="360"/>
+      </w:pPr>
+      <w:rPr>
+        <w:rFonts w:ascii="Wingdings" w:hAnsi="Wingdings" w:hint="default"/>
+        <w:sz w:val="20"/>
+      </w:rPr>
+    </w:lvl>
+    <w:lvl w:ilvl="6" w:tentative="1">
+      <w:start w:val="1"/>
+      <w:numFmt w:val="bullet"/>
+      <w:lvlText w:val=""/>
+      <w:lvlJc w:val="left"/>
+      <w:pPr>
+        <w:tabs>
+          <w:tab w:val="num" w:pos="5040"/>
+        </w:tabs>
+        <w:ind w:left="5040" w:hanging="360"/>
+      </w:pPr>
+      <w:rPr>
+        <w:rFonts w:ascii="Wingdings" w:hAnsi="Wingdings" w:hint="default"/>
+        <w:sz w:val="20"/>
+      </w:rPr>
+    </w:lvl>
+    <w:lvl w:ilvl="7" w:tentative="1">
+      <w:start w:val="1"/>
+      <w:numFmt w:val="bullet"/>
+      <w:lvlText w:val=""/>
+      <w:lvlJc w:val="left"/>
+      <w:pPr>
+        <w:tabs>
+          <w:tab w:val="num" w:pos="5760"/>
+        </w:tabs>
+        <w:ind w:left="5760" w:hanging="360"/>
+      </w:pPr>
+      <w:rPr>
+        <w:rFonts w:ascii="Wingdings" w:hAnsi="Wingdings" w:hint="default"/>
+        <w:sz w:val="20"/>
+      </w:rPr>
+    </w:lvl>
+    <w:lvl w:ilvl="8" w:tentative="1">
+      <w:start w:val="1"/>
+      <w:numFmt w:val="bullet"/>
+      <w:lvlText w:val=""/>
+      <w:lvlJc w:val="left"/>
+      <w:pPr>
+        <w:tabs>
+          <w:tab w:val="num" w:pos="6480"/>
+        </w:tabs>
+        <w:ind w:left="6480" w:hanging="360"/>
+      </w:pPr>
+      <w:rPr>
+        <w:rFonts w:ascii="Wingdings" w:hAnsi="Wingdings" w:hint="default"/>
+        <w:sz w:val="20"/>
+      </w:rPr>
+    </w:lvl>
+  </w:abstractNum>
+  <w:abstractNum w:abstractNumId="4" w15:restartNumberingAfterBreak="0">
     <w:nsid w:val="203660B5"/>
     <w:multiLevelType w:val="multilevel"/>
     <w:tmpl w:val="A98CE4CA"/>
@@ -433,7 +2721,752 @@
       </w:rPr>
     </w:lvl>
   </w:abstractNum>
-  <w:abstractNum w:abstractNumId="2" w15:restartNumberingAfterBreak="0">
+  <w:abstractNum w:abstractNumId="5" w15:restartNumberingAfterBreak="0">
+    <w:nsid w:val="25211E0E"/>
+    <w:multiLevelType w:val="multilevel"/>
+    <w:tmpl w:val="61464460"/>
+    <w:lvl w:ilvl="0">
+      <w:start w:val="1"/>
+      <w:numFmt w:val="bullet"/>
+      <w:lvlText w:val=""/>
+      <w:lvlJc w:val="left"/>
+      <w:pPr>
+        <w:tabs>
+          <w:tab w:val="num" w:pos="720"/>
+        </w:tabs>
+        <w:ind w:left="720" w:hanging="360"/>
+      </w:pPr>
+      <w:rPr>
+        <w:rFonts w:ascii="Symbol" w:hAnsi="Symbol" w:hint="default"/>
+        <w:sz w:val="20"/>
+      </w:rPr>
+    </w:lvl>
+    <w:lvl w:ilvl="1" w:tentative="1">
+      <w:start w:val="1"/>
+      <w:numFmt w:val="bullet"/>
+      <w:lvlText w:val="o"/>
+      <w:lvlJc w:val="left"/>
+      <w:pPr>
+        <w:tabs>
+          <w:tab w:val="num" w:pos="1440"/>
+        </w:tabs>
+        <w:ind w:left="1440" w:hanging="360"/>
+      </w:pPr>
+      <w:rPr>
+        <w:rFonts w:ascii="Courier New" w:hAnsi="Courier New" w:hint="default"/>
+        <w:sz w:val="20"/>
+      </w:rPr>
+    </w:lvl>
+    <w:lvl w:ilvl="2" w:tentative="1">
+      <w:start w:val="1"/>
+      <w:numFmt w:val="bullet"/>
+      <w:lvlText w:val=""/>
+      <w:lvlJc w:val="left"/>
+      <w:pPr>
+        <w:tabs>
+          <w:tab w:val="num" w:pos="2160"/>
+        </w:tabs>
+        <w:ind w:left="2160" w:hanging="360"/>
+      </w:pPr>
+      <w:rPr>
+        <w:rFonts w:ascii="Wingdings" w:hAnsi="Wingdings" w:hint="default"/>
+        <w:sz w:val="20"/>
+      </w:rPr>
+    </w:lvl>
+    <w:lvl w:ilvl="3" w:tentative="1">
+      <w:start w:val="1"/>
+      <w:numFmt w:val="bullet"/>
+      <w:lvlText w:val=""/>
+      <w:lvlJc w:val="left"/>
+      <w:pPr>
+        <w:tabs>
+          <w:tab w:val="num" w:pos="2880"/>
+        </w:tabs>
+        <w:ind w:left="2880" w:hanging="360"/>
+      </w:pPr>
+      <w:rPr>
+        <w:rFonts w:ascii="Wingdings" w:hAnsi="Wingdings" w:hint="default"/>
+        <w:sz w:val="20"/>
+      </w:rPr>
+    </w:lvl>
+    <w:lvl w:ilvl="4" w:tentative="1">
+      <w:start w:val="1"/>
+      <w:numFmt w:val="bullet"/>
+      <w:lvlText w:val=""/>
+      <w:lvlJc w:val="left"/>
+      <w:pPr>
+        <w:tabs>
+          <w:tab w:val="num" w:pos="3600"/>
+        </w:tabs>
+        <w:ind w:left="3600" w:hanging="360"/>
+      </w:pPr>
+      <w:rPr>
+        <w:rFonts w:ascii="Wingdings" w:hAnsi="Wingdings" w:hint="default"/>
+        <w:sz w:val="20"/>
+      </w:rPr>
+    </w:lvl>
+    <w:lvl w:ilvl="5" w:tentative="1">
+      <w:start w:val="1"/>
+      <w:numFmt w:val="bullet"/>
+      <w:lvlText w:val=""/>
+      <w:lvlJc w:val="left"/>
+      <w:pPr>
+        <w:tabs>
+          <w:tab w:val="num" w:pos="4320"/>
+        </w:tabs>
+        <w:ind w:left="4320" w:hanging="360"/>
+      </w:pPr>
+      <w:rPr>
+        <w:rFonts w:ascii="Wingdings" w:hAnsi="Wingdings" w:hint="default"/>
+        <w:sz w:val="20"/>
+      </w:rPr>
+    </w:lvl>
+    <w:lvl w:ilvl="6" w:tentative="1">
+      <w:start w:val="1"/>
+      <w:numFmt w:val="bullet"/>
+      <w:lvlText w:val=""/>
+      <w:lvlJc w:val="left"/>
+      <w:pPr>
+        <w:tabs>
+          <w:tab w:val="num" w:pos="5040"/>
+        </w:tabs>
+        <w:ind w:left="5040" w:hanging="360"/>
+      </w:pPr>
+      <w:rPr>
+        <w:rFonts w:ascii="Wingdings" w:hAnsi="Wingdings" w:hint="default"/>
+        <w:sz w:val="20"/>
+      </w:rPr>
+    </w:lvl>
+    <w:lvl w:ilvl="7" w:tentative="1">
+      <w:start w:val="1"/>
+      <w:numFmt w:val="bullet"/>
+      <w:lvlText w:val=""/>
+      <w:lvlJc w:val="left"/>
+      <w:pPr>
+        <w:tabs>
+          <w:tab w:val="num" w:pos="5760"/>
+        </w:tabs>
+        <w:ind w:left="5760" w:hanging="360"/>
+      </w:pPr>
+      <w:rPr>
+        <w:rFonts w:ascii="Wingdings" w:hAnsi="Wingdings" w:hint="default"/>
+        <w:sz w:val="20"/>
+      </w:rPr>
+    </w:lvl>
+    <w:lvl w:ilvl="8" w:tentative="1">
+      <w:start w:val="1"/>
+      <w:numFmt w:val="bullet"/>
+      <w:lvlText w:val=""/>
+      <w:lvlJc w:val="left"/>
+      <w:pPr>
+        <w:tabs>
+          <w:tab w:val="num" w:pos="6480"/>
+        </w:tabs>
+        <w:ind w:left="6480" w:hanging="360"/>
+      </w:pPr>
+      <w:rPr>
+        <w:rFonts w:ascii="Wingdings" w:hAnsi="Wingdings" w:hint="default"/>
+        <w:sz w:val="20"/>
+      </w:rPr>
+    </w:lvl>
+  </w:abstractNum>
+  <w:abstractNum w:abstractNumId="6" w15:restartNumberingAfterBreak="0">
+    <w:nsid w:val="27A47095"/>
+    <w:multiLevelType w:val="multilevel"/>
+    <w:tmpl w:val="9D4631D8"/>
+    <w:lvl w:ilvl="0">
+      <w:start w:val="1"/>
+      <w:numFmt w:val="bullet"/>
+      <w:lvlText w:val=""/>
+      <w:lvlJc w:val="left"/>
+      <w:pPr>
+        <w:tabs>
+          <w:tab w:val="num" w:pos="720"/>
+        </w:tabs>
+        <w:ind w:left="720" w:hanging="360"/>
+      </w:pPr>
+      <w:rPr>
+        <w:rFonts w:ascii="Symbol" w:hAnsi="Symbol" w:hint="default"/>
+        <w:sz w:val="20"/>
+      </w:rPr>
+    </w:lvl>
+    <w:lvl w:ilvl="1" w:tentative="1">
+      <w:start w:val="1"/>
+      <w:numFmt w:val="bullet"/>
+      <w:lvlText w:val="o"/>
+      <w:lvlJc w:val="left"/>
+      <w:pPr>
+        <w:tabs>
+          <w:tab w:val="num" w:pos="1440"/>
+        </w:tabs>
+        <w:ind w:left="1440" w:hanging="360"/>
+      </w:pPr>
+      <w:rPr>
+        <w:rFonts w:ascii="Courier New" w:hAnsi="Courier New" w:hint="default"/>
+        <w:sz w:val="20"/>
+      </w:rPr>
+    </w:lvl>
+    <w:lvl w:ilvl="2" w:tentative="1">
+      <w:start w:val="1"/>
+      <w:numFmt w:val="bullet"/>
+      <w:lvlText w:val=""/>
+      <w:lvlJc w:val="left"/>
+      <w:pPr>
+        <w:tabs>
+          <w:tab w:val="num" w:pos="2160"/>
+        </w:tabs>
+        <w:ind w:left="2160" w:hanging="360"/>
+      </w:pPr>
+      <w:rPr>
+        <w:rFonts w:ascii="Wingdings" w:hAnsi="Wingdings" w:hint="default"/>
+        <w:sz w:val="20"/>
+      </w:rPr>
+    </w:lvl>
+    <w:lvl w:ilvl="3" w:tentative="1">
+      <w:start w:val="1"/>
+      <w:numFmt w:val="bullet"/>
+      <w:lvlText w:val=""/>
+      <w:lvlJc w:val="left"/>
+      <w:pPr>
+        <w:tabs>
+          <w:tab w:val="num" w:pos="2880"/>
+        </w:tabs>
+        <w:ind w:left="2880" w:hanging="360"/>
+      </w:pPr>
+      <w:rPr>
+        <w:rFonts w:ascii="Wingdings" w:hAnsi="Wingdings" w:hint="default"/>
+        <w:sz w:val="20"/>
+      </w:rPr>
+    </w:lvl>
+    <w:lvl w:ilvl="4" w:tentative="1">
+      <w:start w:val="1"/>
+      <w:numFmt w:val="bullet"/>
+      <w:lvlText w:val=""/>
+      <w:lvlJc w:val="left"/>
+      <w:pPr>
+        <w:tabs>
+          <w:tab w:val="num" w:pos="3600"/>
+        </w:tabs>
+        <w:ind w:left="3600" w:hanging="360"/>
+      </w:pPr>
+      <w:rPr>
+        <w:rFonts w:ascii="Wingdings" w:hAnsi="Wingdings" w:hint="default"/>
+        <w:sz w:val="20"/>
+      </w:rPr>
+    </w:lvl>
+    <w:lvl w:ilvl="5" w:tentative="1">
+      <w:start w:val="1"/>
+      <w:numFmt w:val="bullet"/>
+      <w:lvlText w:val=""/>
+      <w:lvlJc w:val="left"/>
+      <w:pPr>
+        <w:tabs>
+          <w:tab w:val="num" w:pos="4320"/>
+        </w:tabs>
+        <w:ind w:left="4320" w:hanging="360"/>
+      </w:pPr>
+      <w:rPr>
+        <w:rFonts w:ascii="Wingdings" w:hAnsi="Wingdings" w:hint="default"/>
+        <w:sz w:val="20"/>
+      </w:rPr>
+    </w:lvl>
+    <w:lvl w:ilvl="6" w:tentative="1">
+      <w:start w:val="1"/>
+      <w:numFmt w:val="bullet"/>
+      <w:lvlText w:val=""/>
+      <w:lvlJc w:val="left"/>
+      <w:pPr>
+        <w:tabs>
+          <w:tab w:val="num" w:pos="5040"/>
+        </w:tabs>
+        <w:ind w:left="5040" w:hanging="360"/>
+      </w:pPr>
+      <w:rPr>
+        <w:rFonts w:ascii="Wingdings" w:hAnsi="Wingdings" w:hint="default"/>
+        <w:sz w:val="20"/>
+      </w:rPr>
+    </w:lvl>
+    <w:lvl w:ilvl="7" w:tentative="1">
+      <w:start w:val="1"/>
+      <w:numFmt w:val="bullet"/>
+      <w:lvlText w:val=""/>
+      <w:lvlJc w:val="left"/>
+      <w:pPr>
+        <w:tabs>
+          <w:tab w:val="num" w:pos="5760"/>
+        </w:tabs>
+        <w:ind w:left="5760" w:hanging="360"/>
+      </w:pPr>
+      <w:rPr>
+        <w:rFonts w:ascii="Wingdings" w:hAnsi="Wingdings" w:hint="default"/>
+        <w:sz w:val="20"/>
+      </w:rPr>
+    </w:lvl>
+    <w:lvl w:ilvl="8" w:tentative="1">
+      <w:start w:val="1"/>
+      <w:numFmt w:val="bullet"/>
+      <w:lvlText w:val=""/>
+      <w:lvlJc w:val="left"/>
+      <w:pPr>
+        <w:tabs>
+          <w:tab w:val="num" w:pos="6480"/>
+        </w:tabs>
+        <w:ind w:left="6480" w:hanging="360"/>
+      </w:pPr>
+      <w:rPr>
+        <w:rFonts w:ascii="Wingdings" w:hAnsi="Wingdings" w:hint="default"/>
+        <w:sz w:val="20"/>
+      </w:rPr>
+    </w:lvl>
+  </w:abstractNum>
+  <w:abstractNum w:abstractNumId="7" w15:restartNumberingAfterBreak="0">
+    <w:nsid w:val="367F64ED"/>
+    <w:multiLevelType w:val="multilevel"/>
+    <w:tmpl w:val="46DCC6F0"/>
+    <w:lvl w:ilvl="0">
+      <w:start w:val="1"/>
+      <w:numFmt w:val="bullet"/>
+      <w:lvlText w:val=""/>
+      <w:lvlJc w:val="left"/>
+      <w:pPr>
+        <w:tabs>
+          <w:tab w:val="num" w:pos="720"/>
+        </w:tabs>
+        <w:ind w:left="720" w:hanging="360"/>
+      </w:pPr>
+      <w:rPr>
+        <w:rFonts w:ascii="Symbol" w:hAnsi="Symbol" w:hint="default"/>
+        <w:sz w:val="20"/>
+      </w:rPr>
+    </w:lvl>
+    <w:lvl w:ilvl="1" w:tentative="1">
+      <w:start w:val="1"/>
+      <w:numFmt w:val="bullet"/>
+      <w:lvlText w:val="o"/>
+      <w:lvlJc w:val="left"/>
+      <w:pPr>
+        <w:tabs>
+          <w:tab w:val="num" w:pos="1440"/>
+        </w:tabs>
+        <w:ind w:left="1440" w:hanging="360"/>
+      </w:pPr>
+      <w:rPr>
+        <w:rFonts w:ascii="Courier New" w:hAnsi="Courier New" w:hint="default"/>
+        <w:sz w:val="20"/>
+      </w:rPr>
+    </w:lvl>
+    <w:lvl w:ilvl="2" w:tentative="1">
+      <w:start w:val="1"/>
+      <w:numFmt w:val="bullet"/>
+      <w:lvlText w:val=""/>
+      <w:lvlJc w:val="left"/>
+      <w:pPr>
+        <w:tabs>
+          <w:tab w:val="num" w:pos="2160"/>
+        </w:tabs>
+        <w:ind w:left="2160" w:hanging="360"/>
+      </w:pPr>
+      <w:rPr>
+        <w:rFonts w:ascii="Wingdings" w:hAnsi="Wingdings" w:hint="default"/>
+        <w:sz w:val="20"/>
+      </w:rPr>
+    </w:lvl>
+    <w:lvl w:ilvl="3" w:tentative="1">
+      <w:start w:val="1"/>
+      <w:numFmt w:val="bullet"/>
+      <w:lvlText w:val=""/>
+      <w:lvlJc w:val="left"/>
+      <w:pPr>
+        <w:tabs>
+          <w:tab w:val="num" w:pos="2880"/>
+        </w:tabs>
+        <w:ind w:left="2880" w:hanging="360"/>
+      </w:pPr>
+      <w:rPr>
+        <w:rFonts w:ascii="Wingdings" w:hAnsi="Wingdings" w:hint="default"/>
+        <w:sz w:val="20"/>
+      </w:rPr>
+    </w:lvl>
+    <w:lvl w:ilvl="4" w:tentative="1">
+      <w:start w:val="1"/>
+      <w:numFmt w:val="bullet"/>
+      <w:lvlText w:val=""/>
+      <w:lvlJc w:val="left"/>
+      <w:pPr>
+        <w:tabs>
+          <w:tab w:val="num" w:pos="3600"/>
+        </w:tabs>
+        <w:ind w:left="3600" w:hanging="360"/>
+      </w:pPr>
+      <w:rPr>
+        <w:rFonts w:ascii="Wingdings" w:hAnsi="Wingdings" w:hint="default"/>
+        <w:sz w:val="20"/>
+      </w:rPr>
+    </w:lvl>
+    <w:lvl w:ilvl="5" w:tentative="1">
+      <w:start w:val="1"/>
+      <w:numFmt w:val="bullet"/>
+      <w:lvlText w:val=""/>
+      <w:lvlJc w:val="left"/>
+      <w:pPr>
+        <w:tabs>
+          <w:tab w:val="num" w:pos="4320"/>
+        </w:tabs>
+        <w:ind w:left="4320" w:hanging="360"/>
+      </w:pPr>
+      <w:rPr>
+        <w:rFonts w:ascii="Wingdings" w:hAnsi="Wingdings" w:hint="default"/>
+        <w:sz w:val="20"/>
+      </w:rPr>
+    </w:lvl>
+    <w:lvl w:ilvl="6" w:tentative="1">
+      <w:start w:val="1"/>
+      <w:numFmt w:val="bullet"/>
+      <w:lvlText w:val=""/>
+      <w:lvlJc w:val="left"/>
+      <w:pPr>
+        <w:tabs>
+          <w:tab w:val="num" w:pos="5040"/>
+        </w:tabs>
+        <w:ind w:left="5040" w:hanging="360"/>
+      </w:pPr>
+      <w:rPr>
+        <w:rFonts w:ascii="Wingdings" w:hAnsi="Wingdings" w:hint="default"/>
+        <w:sz w:val="20"/>
+      </w:rPr>
+    </w:lvl>
+    <w:lvl w:ilvl="7" w:tentative="1">
+      <w:start w:val="1"/>
+      <w:numFmt w:val="bullet"/>
+      <w:lvlText w:val=""/>
+      <w:lvlJc w:val="left"/>
+      <w:pPr>
+        <w:tabs>
+          <w:tab w:val="num" w:pos="5760"/>
+        </w:tabs>
+        <w:ind w:left="5760" w:hanging="360"/>
+      </w:pPr>
+      <w:rPr>
+        <w:rFonts w:ascii="Wingdings" w:hAnsi="Wingdings" w:hint="default"/>
+        <w:sz w:val="20"/>
+      </w:rPr>
+    </w:lvl>
+    <w:lvl w:ilvl="8" w:tentative="1">
+      <w:start w:val="1"/>
+      <w:numFmt w:val="bullet"/>
+      <w:lvlText w:val=""/>
+      <w:lvlJc w:val="left"/>
+      <w:pPr>
+        <w:tabs>
+          <w:tab w:val="num" w:pos="6480"/>
+        </w:tabs>
+        <w:ind w:left="6480" w:hanging="360"/>
+      </w:pPr>
+      <w:rPr>
+        <w:rFonts w:ascii="Wingdings" w:hAnsi="Wingdings" w:hint="default"/>
+        <w:sz w:val="20"/>
+      </w:rPr>
+    </w:lvl>
+  </w:abstractNum>
+  <w:abstractNum w:abstractNumId="8" w15:restartNumberingAfterBreak="0">
+    <w:nsid w:val="504400D6"/>
+    <w:multiLevelType w:val="multilevel"/>
+    <w:tmpl w:val="6F16FBE0"/>
+    <w:lvl w:ilvl="0">
+      <w:start w:val="1"/>
+      <w:numFmt w:val="bullet"/>
+      <w:lvlText w:val=""/>
+      <w:lvlJc w:val="left"/>
+      <w:pPr>
+        <w:tabs>
+          <w:tab w:val="num" w:pos="720"/>
+        </w:tabs>
+        <w:ind w:left="720" w:hanging="360"/>
+      </w:pPr>
+      <w:rPr>
+        <w:rFonts w:ascii="Symbol" w:hAnsi="Symbol" w:hint="default"/>
+        <w:sz w:val="20"/>
+      </w:rPr>
+    </w:lvl>
+    <w:lvl w:ilvl="1" w:tentative="1">
+      <w:start w:val="1"/>
+      <w:numFmt w:val="bullet"/>
+      <w:lvlText w:val="o"/>
+      <w:lvlJc w:val="left"/>
+      <w:pPr>
+        <w:tabs>
+          <w:tab w:val="num" w:pos="1440"/>
+        </w:tabs>
+        <w:ind w:left="1440" w:hanging="360"/>
+      </w:pPr>
+      <w:rPr>
+        <w:rFonts w:ascii="Courier New" w:hAnsi="Courier New" w:hint="default"/>
+        <w:sz w:val="20"/>
+      </w:rPr>
+    </w:lvl>
+    <w:lvl w:ilvl="2" w:tentative="1">
+      <w:start w:val="1"/>
+      <w:numFmt w:val="bullet"/>
+      <w:lvlText w:val=""/>
+      <w:lvlJc w:val="left"/>
+      <w:pPr>
+        <w:tabs>
+          <w:tab w:val="num" w:pos="2160"/>
+        </w:tabs>
+        <w:ind w:left="2160" w:hanging="360"/>
+      </w:pPr>
+      <w:rPr>
+        <w:rFonts w:ascii="Wingdings" w:hAnsi="Wingdings" w:hint="default"/>
+        <w:sz w:val="20"/>
+      </w:rPr>
+    </w:lvl>
+    <w:lvl w:ilvl="3" w:tentative="1">
+      <w:start w:val="1"/>
+      <w:numFmt w:val="bullet"/>
+      <w:lvlText w:val=""/>
+      <w:lvlJc w:val="left"/>
+      <w:pPr>
+        <w:tabs>
+          <w:tab w:val="num" w:pos="2880"/>
+        </w:tabs>
+        <w:ind w:left="2880" w:hanging="360"/>
+      </w:pPr>
+      <w:rPr>
+        <w:rFonts w:ascii="Wingdings" w:hAnsi="Wingdings" w:hint="default"/>
+        <w:sz w:val="20"/>
+      </w:rPr>
+    </w:lvl>
+    <w:lvl w:ilvl="4" w:tentative="1">
+      <w:start w:val="1"/>
+      <w:numFmt w:val="bullet"/>
+      <w:lvlText w:val=""/>
+      <w:lvlJc w:val="left"/>
+      <w:pPr>
+        <w:tabs>
+          <w:tab w:val="num" w:pos="3600"/>
+        </w:tabs>
+        <w:ind w:left="3600" w:hanging="360"/>
+      </w:pPr>
+      <w:rPr>
+        <w:rFonts w:ascii="Wingdings" w:hAnsi="Wingdings" w:hint="default"/>
+        <w:sz w:val="20"/>
+      </w:rPr>
+    </w:lvl>
+    <w:lvl w:ilvl="5" w:tentative="1">
+      <w:start w:val="1"/>
+      <w:numFmt w:val="bullet"/>
+      <w:lvlText w:val=""/>
+      <w:lvlJc w:val="left"/>
+      <w:pPr>
+        <w:tabs>
+          <w:tab w:val="num" w:pos="4320"/>
+        </w:tabs>
+        <w:ind w:left="4320" w:hanging="360"/>
+      </w:pPr>
+      <w:rPr>
+        <w:rFonts w:ascii="Wingdings" w:hAnsi="Wingdings" w:hint="default"/>
+        <w:sz w:val="20"/>
+      </w:rPr>
+    </w:lvl>
+    <w:lvl w:ilvl="6" w:tentative="1">
+      <w:start w:val="1"/>
+      <w:numFmt w:val="bullet"/>
+      <w:lvlText w:val=""/>
+      <w:lvlJc w:val="left"/>
+      <w:pPr>
+        <w:tabs>
+          <w:tab w:val="num" w:pos="5040"/>
+        </w:tabs>
+        <w:ind w:left="5040" w:hanging="360"/>
+      </w:pPr>
+      <w:rPr>
+        <w:rFonts w:ascii="Wingdings" w:hAnsi="Wingdings" w:hint="default"/>
+        <w:sz w:val="20"/>
+      </w:rPr>
+    </w:lvl>
+    <w:lvl w:ilvl="7" w:tentative="1">
+      <w:start w:val="1"/>
+      <w:numFmt w:val="bullet"/>
+      <w:lvlText w:val=""/>
+      <w:lvlJc w:val="left"/>
+      <w:pPr>
+        <w:tabs>
+          <w:tab w:val="num" w:pos="5760"/>
+        </w:tabs>
+        <w:ind w:left="5760" w:hanging="360"/>
+      </w:pPr>
+      <w:rPr>
+        <w:rFonts w:ascii="Wingdings" w:hAnsi="Wingdings" w:hint="default"/>
+        <w:sz w:val="20"/>
+      </w:rPr>
+    </w:lvl>
+    <w:lvl w:ilvl="8" w:tentative="1">
+      <w:start w:val="1"/>
+      <w:numFmt w:val="bullet"/>
+      <w:lvlText w:val=""/>
+      <w:lvlJc w:val="left"/>
+      <w:pPr>
+        <w:tabs>
+          <w:tab w:val="num" w:pos="6480"/>
+        </w:tabs>
+        <w:ind w:left="6480" w:hanging="360"/>
+      </w:pPr>
+      <w:rPr>
+        <w:rFonts w:ascii="Wingdings" w:hAnsi="Wingdings" w:hint="default"/>
+        <w:sz w:val="20"/>
+      </w:rPr>
+    </w:lvl>
+  </w:abstractNum>
+  <w:abstractNum w:abstractNumId="9" w15:restartNumberingAfterBreak="0">
+    <w:nsid w:val="63225F7D"/>
+    <w:multiLevelType w:val="multilevel"/>
+    <w:tmpl w:val="F35CC418"/>
+    <w:lvl w:ilvl="0">
+      <w:start w:val="1"/>
+      <w:numFmt w:val="bullet"/>
+      <w:lvlText w:val=""/>
+      <w:lvlJc w:val="left"/>
+      <w:pPr>
+        <w:tabs>
+          <w:tab w:val="num" w:pos="720"/>
+        </w:tabs>
+        <w:ind w:left="720" w:hanging="360"/>
+      </w:pPr>
+      <w:rPr>
+        <w:rFonts w:ascii="Symbol" w:hAnsi="Symbol" w:hint="default"/>
+        <w:sz w:val="20"/>
+      </w:rPr>
+    </w:lvl>
+    <w:lvl w:ilvl="1" w:tentative="1">
+      <w:start w:val="1"/>
+      <w:numFmt w:val="bullet"/>
+      <w:lvlText w:val="o"/>
+      <w:lvlJc w:val="left"/>
+      <w:pPr>
+        <w:tabs>
+          <w:tab w:val="num" w:pos="1440"/>
+        </w:tabs>
+        <w:ind w:left="1440" w:hanging="360"/>
+      </w:pPr>
+      <w:rPr>
+        <w:rFonts w:ascii="Courier New" w:hAnsi="Courier New" w:hint="default"/>
+        <w:sz w:val="20"/>
+      </w:rPr>
+    </w:lvl>
+    <w:lvl w:ilvl="2" w:tentative="1">
+      <w:start w:val="1"/>
+      <w:numFmt w:val="bullet"/>
+      <w:lvlText w:val=""/>
+      <w:lvlJc w:val="left"/>
+      <w:pPr>
+        <w:tabs>
+          <w:tab w:val="num" w:pos="2160"/>
+        </w:tabs>
+        <w:ind w:left="2160" w:hanging="360"/>
+      </w:pPr>
+      <w:rPr>
+        <w:rFonts w:ascii="Wingdings" w:hAnsi="Wingdings" w:hint="default"/>
+        <w:sz w:val="20"/>
+      </w:rPr>
+    </w:lvl>
+    <w:lvl w:ilvl="3" w:tentative="1">
+      <w:start w:val="1"/>
+      <w:numFmt w:val="bullet"/>
+      <w:lvlText w:val=""/>
+      <w:lvlJc w:val="left"/>
+      <w:pPr>
+        <w:tabs>
+          <w:tab w:val="num" w:pos="2880"/>
+        </w:tabs>
+        <w:ind w:left="2880" w:hanging="360"/>
+      </w:pPr>
+      <w:rPr>
+        <w:rFonts w:ascii="Wingdings" w:hAnsi="Wingdings" w:hint="default"/>
+        <w:sz w:val="20"/>
+      </w:rPr>
+    </w:lvl>
+    <w:lvl w:ilvl="4" w:tentative="1">
+      <w:start w:val="1"/>
+      <w:numFmt w:val="bullet"/>
+      <w:lvlText w:val=""/>
+      <w:lvlJc w:val="left"/>
+      <w:pPr>
+        <w:tabs>
+          <w:tab w:val="num" w:pos="3600"/>
+        </w:tabs>
+        <w:ind w:left="3600" w:hanging="360"/>
+      </w:pPr>
+      <w:rPr>
+        <w:rFonts w:ascii="Wingdings" w:hAnsi="Wingdings" w:hint="default"/>
+        <w:sz w:val="20"/>
+      </w:rPr>
+    </w:lvl>
+    <w:lvl w:ilvl="5" w:tentative="1">
+      <w:start w:val="1"/>
+      <w:numFmt w:val="bullet"/>
+      <w:lvlText w:val=""/>
+      <w:lvlJc w:val="left"/>
+      <w:pPr>
+        <w:tabs>
+          <w:tab w:val="num" w:pos="4320"/>
+        </w:tabs>
+        <w:ind w:left="4320" w:hanging="360"/>
+      </w:pPr>
+      <w:rPr>
+        <w:rFonts w:ascii="Wingdings" w:hAnsi="Wingdings" w:hint="default"/>
+        <w:sz w:val="20"/>
+      </w:rPr>
+    </w:lvl>
+    <w:lvl w:ilvl="6" w:tentative="1">
+      <w:start w:val="1"/>
+      <w:numFmt w:val="bullet"/>
+      <w:lvlText w:val=""/>
+      <w:lvlJc w:val="left"/>
+      <w:pPr>
+        <w:tabs>
+          <w:tab w:val="num" w:pos="5040"/>
+        </w:tabs>
+        <w:ind w:left="5040" w:hanging="360"/>
+      </w:pPr>
+      <w:rPr>
+        <w:rFonts w:ascii="Wingdings" w:hAnsi="Wingdings" w:hint="default"/>
+        <w:sz w:val="20"/>
+      </w:rPr>
+    </w:lvl>
+    <w:lvl w:ilvl="7" w:tentative="1">
+      <w:start w:val="1"/>
+      <w:numFmt w:val="bullet"/>
+      <w:lvlText w:val=""/>
+      <w:lvlJc w:val="left"/>
+      <w:pPr>
+        <w:tabs>
+          <w:tab w:val="num" w:pos="5760"/>
+        </w:tabs>
+        <w:ind w:left="5760" w:hanging="360"/>
+      </w:pPr>
+      <w:rPr>
+        <w:rFonts w:ascii="Wingdings" w:hAnsi="Wingdings" w:hint="default"/>
+        <w:sz w:val="20"/>
+      </w:rPr>
+    </w:lvl>
+    <w:lvl w:ilvl="8" w:tentative="1">
+      <w:start w:val="1"/>
+      <w:numFmt w:val="bullet"/>
+      <w:lvlText w:val=""/>
+      <w:lvlJc w:val="left"/>
+      <w:pPr>
+        <w:tabs>
+          <w:tab w:val="num" w:pos="6480"/>
+        </w:tabs>
+        <w:ind w:left="6480" w:hanging="360"/>
+      </w:pPr>
+      <w:rPr>
+        <w:rFonts w:ascii="Wingdings" w:hAnsi="Wingdings" w:hint="default"/>
+        <w:sz w:val="20"/>
+      </w:rPr>
+    </w:lvl>
+  </w:abstractNum>
+  <w:abstractNum w:abstractNumId="10" w15:restartNumberingAfterBreak="0">
     <w:nsid w:val="6A5801D8"/>
     <w:multiLevelType w:val="multilevel"/>
     <w:tmpl w:val="D4E00B4E"/>
@@ -582,7 +3615,156 @@
       </w:rPr>
     </w:lvl>
   </w:abstractNum>
-  <w:abstractNum w:abstractNumId="3" w15:restartNumberingAfterBreak="0">
+  <w:abstractNum w:abstractNumId="11" w15:restartNumberingAfterBreak="0">
+    <w:nsid w:val="6A877E43"/>
+    <w:multiLevelType w:val="multilevel"/>
+    <w:tmpl w:val="2902896A"/>
+    <w:lvl w:ilvl="0">
+      <w:start w:val="1"/>
+      <w:numFmt w:val="bullet"/>
+      <w:lvlText w:val=""/>
+      <w:lvlJc w:val="left"/>
+      <w:pPr>
+        <w:tabs>
+          <w:tab w:val="num" w:pos="720"/>
+        </w:tabs>
+        <w:ind w:left="720" w:hanging="360"/>
+      </w:pPr>
+      <w:rPr>
+        <w:rFonts w:ascii="Symbol" w:hAnsi="Symbol" w:hint="default"/>
+        <w:sz w:val="20"/>
+      </w:rPr>
+    </w:lvl>
+    <w:lvl w:ilvl="1" w:tentative="1">
+      <w:start w:val="1"/>
+      <w:numFmt w:val="bullet"/>
+      <w:lvlText w:val="o"/>
+      <w:lvlJc w:val="left"/>
+      <w:pPr>
+        <w:tabs>
+          <w:tab w:val="num" w:pos="1440"/>
+        </w:tabs>
+        <w:ind w:left="1440" w:hanging="360"/>
+      </w:pPr>
+      <w:rPr>
+        <w:rFonts w:ascii="Courier New" w:hAnsi="Courier New" w:hint="default"/>
+        <w:sz w:val="20"/>
+      </w:rPr>
+    </w:lvl>
+    <w:lvl w:ilvl="2" w:tentative="1">
+      <w:start w:val="1"/>
+      <w:numFmt w:val="bullet"/>
+      <w:lvlText w:val=""/>
+      <w:lvlJc w:val="left"/>
+      <w:pPr>
+        <w:tabs>
+          <w:tab w:val="num" w:pos="2160"/>
+        </w:tabs>
+        <w:ind w:left="2160" w:hanging="360"/>
+      </w:pPr>
+      <w:rPr>
+        <w:rFonts w:ascii="Wingdings" w:hAnsi="Wingdings" w:hint="default"/>
+        <w:sz w:val="20"/>
+      </w:rPr>
+    </w:lvl>
+    <w:lvl w:ilvl="3" w:tentative="1">
+      <w:start w:val="1"/>
+      <w:numFmt w:val="bullet"/>
+      <w:lvlText w:val=""/>
+      <w:lvlJc w:val="left"/>
+      <w:pPr>
+        <w:tabs>
+          <w:tab w:val="num" w:pos="2880"/>
+        </w:tabs>
+        <w:ind w:left="2880" w:hanging="360"/>
+      </w:pPr>
+      <w:rPr>
+        <w:rFonts w:ascii="Wingdings" w:hAnsi="Wingdings" w:hint="default"/>
+        <w:sz w:val="20"/>
+      </w:rPr>
+    </w:lvl>
+    <w:lvl w:ilvl="4" w:tentative="1">
+      <w:start w:val="1"/>
+      <w:numFmt w:val="bullet"/>
+      <w:lvlText w:val=""/>
+      <w:lvlJc w:val="left"/>
+      <w:pPr>
+        <w:tabs>
+          <w:tab w:val="num" w:pos="3600"/>
+        </w:tabs>
+        <w:ind w:left="3600" w:hanging="360"/>
+      </w:pPr>
+      <w:rPr>
+        <w:rFonts w:ascii="Wingdings" w:hAnsi="Wingdings" w:hint="default"/>
+        <w:sz w:val="20"/>
+      </w:rPr>
+    </w:lvl>
+    <w:lvl w:ilvl="5" w:tentative="1">
+      <w:start w:val="1"/>
+      <w:numFmt w:val="bullet"/>
+      <w:lvlText w:val=""/>
+      <w:lvlJc w:val="left"/>
+      <w:pPr>
+        <w:tabs>
+          <w:tab w:val="num" w:pos="4320"/>
+        </w:tabs>
+        <w:ind w:left="4320" w:hanging="360"/>
+      </w:pPr>
+      <w:rPr>
+        <w:rFonts w:ascii="Wingdings" w:hAnsi="Wingdings" w:hint="default"/>
+        <w:sz w:val="20"/>
+      </w:rPr>
+    </w:lvl>
+    <w:lvl w:ilvl="6" w:tentative="1">
+      <w:start w:val="1"/>
+      <w:numFmt w:val="bullet"/>
+      <w:lvlText w:val=""/>
+      <w:lvlJc w:val="left"/>
+      <w:pPr>
+        <w:tabs>
+          <w:tab w:val="num" w:pos="5040"/>
+        </w:tabs>
+        <w:ind w:left="5040" w:hanging="360"/>
+      </w:pPr>
+      <w:rPr>
+        <w:rFonts w:ascii="Wingdings" w:hAnsi="Wingdings" w:hint="default"/>
+        <w:sz w:val="20"/>
+      </w:rPr>
+    </w:lvl>
+    <w:lvl w:ilvl="7" w:tentative="1">
+      <w:start w:val="1"/>
+      <w:numFmt w:val="bullet"/>
+      <w:lvlText w:val=""/>
+      <w:lvlJc w:val="left"/>
+      <w:pPr>
+        <w:tabs>
+          <w:tab w:val="num" w:pos="5760"/>
+        </w:tabs>
+        <w:ind w:left="5760" w:hanging="360"/>
+      </w:pPr>
+      <w:rPr>
+        <w:rFonts w:ascii="Wingdings" w:hAnsi="Wingdings" w:hint="default"/>
+        <w:sz w:val="20"/>
+      </w:rPr>
+    </w:lvl>
+    <w:lvl w:ilvl="8" w:tentative="1">
+      <w:start w:val="1"/>
+      <w:numFmt w:val="bullet"/>
+      <w:lvlText w:val=""/>
+      <w:lvlJc w:val="left"/>
+      <w:pPr>
+        <w:tabs>
+          <w:tab w:val="num" w:pos="6480"/>
+        </w:tabs>
+        <w:ind w:left="6480" w:hanging="360"/>
+      </w:pPr>
+      <w:rPr>
+        <w:rFonts w:ascii="Wingdings" w:hAnsi="Wingdings" w:hint="default"/>
+        <w:sz w:val="20"/>
+      </w:rPr>
+    </w:lvl>
+  </w:abstractNum>
+  <w:abstractNum w:abstractNumId="12" w15:restartNumberingAfterBreak="0">
     <w:nsid w:val="6CE01331"/>
     <w:multiLevelType w:val="multilevel"/>
     <w:tmpl w:val="D33AD79A"/>
@@ -731,17 +3913,348 @@
       </w:rPr>
     </w:lvl>
   </w:abstractNum>
+  <w:abstractNum w:abstractNumId="13" w15:restartNumberingAfterBreak="0">
+    <w:nsid w:val="70523ABF"/>
+    <w:multiLevelType w:val="multilevel"/>
+    <w:tmpl w:val="EFEE07A8"/>
+    <w:lvl w:ilvl="0">
+      <w:start w:val="1"/>
+      <w:numFmt w:val="bullet"/>
+      <w:lvlText w:val=""/>
+      <w:lvlJc w:val="left"/>
+      <w:pPr>
+        <w:tabs>
+          <w:tab w:val="num" w:pos="720"/>
+        </w:tabs>
+        <w:ind w:left="720" w:hanging="360"/>
+      </w:pPr>
+      <w:rPr>
+        <w:rFonts w:ascii="Symbol" w:hAnsi="Symbol" w:hint="default"/>
+        <w:sz w:val="20"/>
+      </w:rPr>
+    </w:lvl>
+    <w:lvl w:ilvl="1" w:tentative="1">
+      <w:start w:val="1"/>
+      <w:numFmt w:val="bullet"/>
+      <w:lvlText w:val="o"/>
+      <w:lvlJc w:val="left"/>
+      <w:pPr>
+        <w:tabs>
+          <w:tab w:val="num" w:pos="1440"/>
+        </w:tabs>
+        <w:ind w:left="1440" w:hanging="360"/>
+      </w:pPr>
+      <w:rPr>
+        <w:rFonts w:ascii="Courier New" w:hAnsi="Courier New" w:hint="default"/>
+        <w:sz w:val="20"/>
+      </w:rPr>
+    </w:lvl>
+    <w:lvl w:ilvl="2" w:tentative="1">
+      <w:start w:val="1"/>
+      <w:numFmt w:val="bullet"/>
+      <w:lvlText w:val=""/>
+      <w:lvlJc w:val="left"/>
+      <w:pPr>
+        <w:tabs>
+          <w:tab w:val="num" w:pos="2160"/>
+        </w:tabs>
+        <w:ind w:left="2160" w:hanging="360"/>
+      </w:pPr>
+      <w:rPr>
+        <w:rFonts w:ascii="Wingdings" w:hAnsi="Wingdings" w:hint="default"/>
+        <w:sz w:val="20"/>
+      </w:rPr>
+    </w:lvl>
+    <w:lvl w:ilvl="3" w:tentative="1">
+      <w:start w:val="1"/>
+      <w:numFmt w:val="bullet"/>
+      <w:lvlText w:val=""/>
+      <w:lvlJc w:val="left"/>
+      <w:pPr>
+        <w:tabs>
+          <w:tab w:val="num" w:pos="2880"/>
+        </w:tabs>
+        <w:ind w:left="2880" w:hanging="360"/>
+      </w:pPr>
+      <w:rPr>
+        <w:rFonts w:ascii="Wingdings" w:hAnsi="Wingdings" w:hint="default"/>
+        <w:sz w:val="20"/>
+      </w:rPr>
+    </w:lvl>
+    <w:lvl w:ilvl="4" w:tentative="1">
+      <w:start w:val="1"/>
+      <w:numFmt w:val="bullet"/>
+      <w:lvlText w:val=""/>
+      <w:lvlJc w:val="left"/>
+      <w:pPr>
+        <w:tabs>
+          <w:tab w:val="num" w:pos="3600"/>
+        </w:tabs>
+        <w:ind w:left="3600" w:hanging="360"/>
+      </w:pPr>
+      <w:rPr>
+        <w:rFonts w:ascii="Wingdings" w:hAnsi="Wingdings" w:hint="default"/>
+        <w:sz w:val="20"/>
+      </w:rPr>
+    </w:lvl>
+    <w:lvl w:ilvl="5" w:tentative="1">
+      <w:start w:val="1"/>
+      <w:numFmt w:val="bullet"/>
+      <w:lvlText w:val=""/>
+      <w:lvlJc w:val="left"/>
+      <w:pPr>
+        <w:tabs>
+          <w:tab w:val="num" w:pos="4320"/>
+        </w:tabs>
+        <w:ind w:left="4320" w:hanging="360"/>
+      </w:pPr>
+      <w:rPr>
+        <w:rFonts w:ascii="Wingdings" w:hAnsi="Wingdings" w:hint="default"/>
+        <w:sz w:val="20"/>
+      </w:rPr>
+    </w:lvl>
+    <w:lvl w:ilvl="6" w:tentative="1">
+      <w:start w:val="1"/>
+      <w:numFmt w:val="bullet"/>
+      <w:lvlText w:val=""/>
+      <w:lvlJc w:val="left"/>
+      <w:pPr>
+        <w:tabs>
+          <w:tab w:val="num" w:pos="5040"/>
+        </w:tabs>
+        <w:ind w:left="5040" w:hanging="360"/>
+      </w:pPr>
+      <w:rPr>
+        <w:rFonts w:ascii="Wingdings" w:hAnsi="Wingdings" w:hint="default"/>
+        <w:sz w:val="20"/>
+      </w:rPr>
+    </w:lvl>
+    <w:lvl w:ilvl="7" w:tentative="1">
+      <w:start w:val="1"/>
+      <w:numFmt w:val="bullet"/>
+      <w:lvlText w:val=""/>
+      <w:lvlJc w:val="left"/>
+      <w:pPr>
+        <w:tabs>
+          <w:tab w:val="num" w:pos="5760"/>
+        </w:tabs>
+        <w:ind w:left="5760" w:hanging="360"/>
+      </w:pPr>
+      <w:rPr>
+        <w:rFonts w:ascii="Wingdings" w:hAnsi="Wingdings" w:hint="default"/>
+        <w:sz w:val="20"/>
+      </w:rPr>
+    </w:lvl>
+    <w:lvl w:ilvl="8" w:tentative="1">
+      <w:start w:val="1"/>
+      <w:numFmt w:val="bullet"/>
+      <w:lvlText w:val=""/>
+      <w:lvlJc w:val="left"/>
+      <w:pPr>
+        <w:tabs>
+          <w:tab w:val="num" w:pos="6480"/>
+        </w:tabs>
+        <w:ind w:left="6480" w:hanging="360"/>
+      </w:pPr>
+      <w:rPr>
+        <w:rFonts w:ascii="Wingdings" w:hAnsi="Wingdings" w:hint="default"/>
+        <w:sz w:val="20"/>
+      </w:rPr>
+    </w:lvl>
+  </w:abstractNum>
+  <w:abstractNum w:abstractNumId="14" w15:restartNumberingAfterBreak="0">
+    <w:nsid w:val="7980040D"/>
+    <w:multiLevelType w:val="multilevel"/>
+    <w:tmpl w:val="1BA6F1DA"/>
+    <w:lvl w:ilvl="0">
+      <w:start w:val="1"/>
+      <w:numFmt w:val="bullet"/>
+      <w:lvlText w:val=""/>
+      <w:lvlJc w:val="left"/>
+      <w:pPr>
+        <w:tabs>
+          <w:tab w:val="num" w:pos="720"/>
+        </w:tabs>
+        <w:ind w:left="720" w:hanging="360"/>
+      </w:pPr>
+      <w:rPr>
+        <w:rFonts w:ascii="Symbol" w:hAnsi="Symbol" w:hint="default"/>
+        <w:sz w:val="20"/>
+      </w:rPr>
+    </w:lvl>
+    <w:lvl w:ilvl="1" w:tentative="1">
+      <w:start w:val="1"/>
+      <w:numFmt w:val="bullet"/>
+      <w:lvlText w:val="o"/>
+      <w:lvlJc w:val="left"/>
+      <w:pPr>
+        <w:tabs>
+          <w:tab w:val="num" w:pos="1440"/>
+        </w:tabs>
+        <w:ind w:left="1440" w:hanging="360"/>
+      </w:pPr>
+      <w:rPr>
+        <w:rFonts w:ascii="Courier New" w:hAnsi="Courier New" w:hint="default"/>
+        <w:sz w:val="20"/>
+      </w:rPr>
+    </w:lvl>
+    <w:lvl w:ilvl="2" w:tentative="1">
+      <w:start w:val="1"/>
+      <w:numFmt w:val="bullet"/>
+      <w:lvlText w:val=""/>
+      <w:lvlJc w:val="left"/>
+      <w:pPr>
+        <w:tabs>
+          <w:tab w:val="num" w:pos="2160"/>
+        </w:tabs>
+        <w:ind w:left="2160" w:hanging="360"/>
+      </w:pPr>
+      <w:rPr>
+        <w:rFonts w:ascii="Wingdings" w:hAnsi="Wingdings" w:hint="default"/>
+        <w:sz w:val="20"/>
+      </w:rPr>
+    </w:lvl>
+    <w:lvl w:ilvl="3" w:tentative="1">
+      <w:start w:val="1"/>
+      <w:numFmt w:val="bullet"/>
+      <w:lvlText w:val=""/>
+      <w:lvlJc w:val="left"/>
+      <w:pPr>
+        <w:tabs>
+          <w:tab w:val="num" w:pos="2880"/>
+        </w:tabs>
+        <w:ind w:left="2880" w:hanging="360"/>
+      </w:pPr>
+      <w:rPr>
+        <w:rFonts w:ascii="Wingdings" w:hAnsi="Wingdings" w:hint="default"/>
+        <w:sz w:val="20"/>
+      </w:rPr>
+    </w:lvl>
+    <w:lvl w:ilvl="4" w:tentative="1">
+      <w:start w:val="1"/>
+      <w:numFmt w:val="bullet"/>
+      <w:lvlText w:val=""/>
+      <w:lvlJc w:val="left"/>
+      <w:pPr>
+        <w:tabs>
+          <w:tab w:val="num" w:pos="3600"/>
+        </w:tabs>
+        <w:ind w:left="3600" w:hanging="360"/>
+      </w:pPr>
+      <w:rPr>
+        <w:rFonts w:ascii="Wingdings" w:hAnsi="Wingdings" w:hint="default"/>
+        <w:sz w:val="20"/>
+      </w:rPr>
+    </w:lvl>
+    <w:lvl w:ilvl="5" w:tentative="1">
+      <w:start w:val="1"/>
+      <w:numFmt w:val="bullet"/>
+      <w:lvlText w:val=""/>
+      <w:lvlJc w:val="left"/>
+      <w:pPr>
+        <w:tabs>
+          <w:tab w:val="num" w:pos="4320"/>
+        </w:tabs>
+        <w:ind w:left="4320" w:hanging="360"/>
+      </w:pPr>
+      <w:rPr>
+        <w:rFonts w:ascii="Wingdings" w:hAnsi="Wingdings" w:hint="default"/>
+        <w:sz w:val="20"/>
+      </w:rPr>
+    </w:lvl>
+    <w:lvl w:ilvl="6" w:tentative="1">
+      <w:start w:val="1"/>
+      <w:numFmt w:val="bullet"/>
+      <w:lvlText w:val=""/>
+      <w:lvlJc w:val="left"/>
+      <w:pPr>
+        <w:tabs>
+          <w:tab w:val="num" w:pos="5040"/>
+        </w:tabs>
+        <w:ind w:left="5040" w:hanging="360"/>
+      </w:pPr>
+      <w:rPr>
+        <w:rFonts w:ascii="Wingdings" w:hAnsi="Wingdings" w:hint="default"/>
+        <w:sz w:val="20"/>
+      </w:rPr>
+    </w:lvl>
+    <w:lvl w:ilvl="7" w:tentative="1">
+      <w:start w:val="1"/>
+      <w:numFmt w:val="bullet"/>
+      <w:lvlText w:val=""/>
+      <w:lvlJc w:val="left"/>
+      <w:pPr>
+        <w:tabs>
+          <w:tab w:val="num" w:pos="5760"/>
+        </w:tabs>
+        <w:ind w:left="5760" w:hanging="360"/>
+      </w:pPr>
+      <w:rPr>
+        <w:rFonts w:ascii="Wingdings" w:hAnsi="Wingdings" w:hint="default"/>
+        <w:sz w:val="20"/>
+      </w:rPr>
+    </w:lvl>
+    <w:lvl w:ilvl="8" w:tentative="1">
+      <w:start w:val="1"/>
+      <w:numFmt w:val="bullet"/>
+      <w:lvlText w:val=""/>
+      <w:lvlJc w:val="left"/>
+      <w:pPr>
+        <w:tabs>
+          <w:tab w:val="num" w:pos="6480"/>
+        </w:tabs>
+        <w:ind w:left="6480" w:hanging="360"/>
+      </w:pPr>
+      <w:rPr>
+        <w:rFonts w:ascii="Wingdings" w:hAnsi="Wingdings" w:hint="default"/>
+        <w:sz w:val="20"/>
+      </w:rPr>
+    </w:lvl>
+  </w:abstractNum>
   <w:num w:numId="1" w16cid:durableId="451941350">
+    <w:abstractNumId w:val="2"/>
+  </w:num>
+  <w:num w:numId="2" w16cid:durableId="1274283314">
+    <w:abstractNumId w:val="4"/>
+  </w:num>
+  <w:num w:numId="3" w16cid:durableId="1696999242">
+    <w:abstractNumId w:val="12"/>
+  </w:num>
+  <w:num w:numId="4" w16cid:durableId="228884227">
+    <w:abstractNumId w:val="10"/>
+  </w:num>
+  <w:num w:numId="5" w16cid:durableId="998847812">
+    <w:abstractNumId w:val="8"/>
+  </w:num>
+  <w:num w:numId="6" w16cid:durableId="882985353">
+    <w:abstractNumId w:val="5"/>
+  </w:num>
+  <w:num w:numId="7" w16cid:durableId="520357494">
+    <w:abstractNumId w:val="11"/>
+  </w:num>
+  <w:num w:numId="8" w16cid:durableId="1501773163">
+    <w:abstractNumId w:val="3"/>
+  </w:num>
+  <w:num w:numId="9" w16cid:durableId="766080372">
+    <w:abstractNumId w:val="9"/>
+  </w:num>
+  <w:num w:numId="10" w16cid:durableId="1014259907">
+    <w:abstractNumId w:val="7"/>
+  </w:num>
+  <w:num w:numId="11" w16cid:durableId="464858945">
+    <w:abstractNumId w:val="13"/>
+  </w:num>
+  <w:num w:numId="12" w16cid:durableId="33623961">
+    <w:abstractNumId w:val="1"/>
+  </w:num>
+  <w:num w:numId="13" w16cid:durableId="386882706">
     <w:abstractNumId w:val="0"/>
   </w:num>
-  <w:num w:numId="2" w16cid:durableId="1274283314">
-    <w:abstractNumId w:val="1"/>
+  <w:num w:numId="14" w16cid:durableId="1128890049">
+    <w:abstractNumId w:val="6"/>
   </w:num>
-  <w:num w:numId="3" w16cid:durableId="1696999242">
-    <w:abstractNumId w:val="3"/>
-  </w:num>
-  <w:num w:numId="4" w16cid:durableId="228884227">
-    <w:abstractNumId w:val="2"/>
+  <w:num w:numId="15" w16cid:durableId="1657105184">
+    <w:abstractNumId w:val="14"/>
   </w:num>
 </w:numbering>
 </file>

</xml_diff>